<commit_message>
docs: keep only EN/VI v3.2 reports + 12-week progress report
- Add bilingual technical report: v3.2_en (all English, English diagrams)
  and v3.2_vi (all Vietnamese, Vietnamese diagrams)
- Rewrite weekly progress report to 12 weeks, per-member tasks aligned to v3.2
- Remove superseded reports (v2, v3, v3.1, mixed-language v3.2)
- Add report-assets/ (diagram generators + EN/VI build scripts)

Co-Authored-By: Claude Opus 4.8 <noreply@anthropic.com>
</commit_message>
<xml_diff>
--- a/BaoCao_TienDo_Tuan.docx
+++ b/BaoCao_TienDo_Tuan.docx
@@ -37,7 +37,7 @@
           <w:i/>
           <w:sz w:val="24"/>
         </w:rPr>
-        <w:t>Thư viện Đại học Phenikaa · Kế hoạch &amp; nhật ký công việc 8 tuần</w:t>
+        <w:t>Thư viện Đại học Phenikaa · Kế hoạch &amp; nhật ký công việc 12 tuần</w:t>
       </w:r>
     </w:p>
     <w:p/>
@@ -164,12 +164,8 @@
             <w:tcW w:type="dxa" w:w="4320"/>
           </w:tcPr>
           <w:p>
-            <w:r/>
             <w:r>
-              <w:rPr>
-                <w:sz w:val="19"/>
-              </w:rPr>
-              <w:t>8 tuần</w:t>
+              <w:t>12 tuần</w:t>
             </w:r>
           </w:p>
         </w:tc>
@@ -253,7 +249,7 @@
           <w:b w:val="0"/>
           <w:i w:val="0"/>
         </w:rPr>
-        <w:t>Báo cáo trình bày công việc theo từng tuần của 4 thành viên trong suốt 8 tuần thực hiện dự án. Bốn tuần đầu xây dựng hệ thống nền tảng; bốn tuần sau chỉnh sửa theo nhận xét của giảng viên: bỏ bước thủ thư duyệt, chuyển sang mượn tự phục vụ bằng mã mượn với hạn lấy 24 giờ, tách bạch vai trò Admin và Thủ thư, và bổ sung trang phân quyền chỉnh trực tiếp trên giao diện.</w:t>
+        <w:t>Báo cáo trình bày công việc theo từng tuần của 4 thành viên trong 12 tuần thực hiện dự án. Sáu tuần đầu phân tích, thiết kế và xây dựng hệ thống nền tảng (mô hình có thủ thư duyệt); sáu tuần sau chỉnh sửa theo nhận xét của giảng viên: bỏ bước duyệt, chuyển sang mượn tự phục vụ bằng mã lấy sách với hạn 24 giờ, tách bạch vai trò Admin và Thủ thư, bổ sung ma trận phân quyền và trang cấu hình quy tắc/ẩn-hiện ngay trên giao diện, thêm thông báo in-app và đọc tại chỗ.</w:t>
       </w:r>
     </w:p>
     <w:tbl>
@@ -274,12 +270,7 @@
             <w:tcW w:type="dxa" w:w="2880"/>
           </w:tcPr>
           <w:p>
-            <w:r/>
             <w:r>
-              <w:rPr>
-                <w:b/>
-                <w:sz w:val="20"/>
-              </w:rPr>
               <w:t>Thành viên</w:t>
             </w:r>
           </w:p>
@@ -289,12 +280,7 @@
             <w:tcW w:type="dxa" w:w="2880"/>
           </w:tcPr>
           <w:p>
-            <w:r/>
             <w:r>
-              <w:rPr>
-                <w:b/>
-                <w:sz w:val="20"/>
-              </w:rPr>
               <w:t>Mô-đun phụ trách</w:t>
             </w:r>
           </w:p>
@@ -304,12 +290,7 @@
             <w:tcW w:type="dxa" w:w="2880"/>
           </w:tcPr>
           <w:p>
-            <w:r/>
             <w:r>
-              <w:rPr>
-                <w:b/>
-                <w:sz w:val="20"/>
-              </w:rPr>
               <w:t>Tệp/thành phần chính</w:t>
             </w:r>
           </w:p>
@@ -321,11 +302,7 @@
             <w:tcW w:type="dxa" w:w="2880"/>
           </w:tcPr>
           <w:p>
-            <w:r/>
             <w:r>
-              <w:rPr>
-                <w:sz w:val="19"/>
-              </w:rPr>
               <w:t>Nguyễn Thị Thu Hà</w:t>
             </w:r>
           </w:p>
@@ -335,12 +312,8 @@
             <w:tcW w:type="dxa" w:w="2880"/>
           </w:tcPr>
           <w:p>
-            <w:r/>
             <w:r>
-              <w:rPr>
-                <w:sz w:val="19"/>
-              </w:rPr>
-              <w:t>Xác thực, Người dùng &amp; Phân quyền</w:t>
+              <w:t>Vòng đời phiếu mượn, Lấy sách &amp; Lập lịch</w:t>
             </w:r>
           </w:p>
         </w:tc>
@@ -349,12 +322,8 @@
             <w:tcW w:type="dxa" w:w="2880"/>
           </w:tcPr>
           <w:p>
-            <w:r/>
             <w:r>
-              <w:rPr>
-                <w:sz w:val="19"/>
-              </w:rPr>
-              <w:t>SecurityConfig, AuthController, CustomUserDetailsService, UserService, RuleService, users.html, config.html</w:t>
+              <w:t>LoanService, NotificationService, Loan.java, LoanDetail.java, PickupExpiryScheduler, LibrarianController, Notification.java, loans.html, my-loans.html, inhouse.html, notifications.html</w:t>
             </w:r>
           </w:p>
         </w:tc>
@@ -365,11 +334,7 @@
             <w:tcW w:type="dxa" w:w="2880"/>
           </w:tcPr>
           <w:p>
-            <w:r/>
             <w:r>
-              <w:rPr>
-                <w:sz w:val="19"/>
-              </w:rPr>
               <w:t>Bùi Thanh Thảo</w:t>
             </w:r>
           </w:p>
@@ -379,12 +344,8 @@
             <w:tcW w:type="dxa" w:w="2880"/>
           </w:tcPr>
           <w:p>
-            <w:r/>
             <w:r>
-              <w:rPr>
-                <w:sz w:val="19"/>
-              </w:rPr>
-              <w:t>Danh mục &amp; Tìm kiếm sách</w:t>
+              <w:t>Quy tắc mượn, Ẩn/hiện &amp; Giỏ sách</w:t>
             </w:r>
           </w:p>
         </w:tc>
@@ -393,12 +354,8 @@
             <w:tcW w:type="dxa" w:w="2880"/>
           </w:tcPr>
           <w:p>
-            <w:r/>
             <w:r>
-              <w:rPr>
-                <w:sz w:val="19"/>
-              </w:rPr>
-              <w:t>BookService, BookRepository, Book.java, home.html, book-detail.html, books.html, book-form.html</w:t>
+              <w:t>RuleEngine, RuleService, BorrowingRule.java (+visible), CartItem, RuleConfigForm, cart.html, rules.html, data.sql (quy tắc)</w:t>
             </w:r>
           </w:p>
         </w:tc>
@@ -409,11 +366,7 @@
             <w:tcW w:type="dxa" w:w="2880"/>
           </w:tcPr>
           <w:p>
-            <w:r/>
             <w:r>
-              <w:rPr>
-                <w:sz w:val="19"/>
-              </w:rPr>
               <w:t>Phạm Minh Tuyên</w:t>
             </w:r>
           </w:p>
@@ -423,12 +376,8 @@
             <w:tcW w:type="dxa" w:w="2880"/>
           </w:tcPr>
           <w:p>
-            <w:r/>
             <w:r>
-              <w:rPr>
-                <w:sz w:val="19"/>
-              </w:rPr>
-              <w:t>Quy tắc mượn, Ẩn/hiện &amp; Giỏ sách</w:t>
+              <w:t>Xác thực, Người dùng &amp; Phân quyền</w:t>
             </w:r>
           </w:p>
         </w:tc>
@@ -437,12 +386,8 @@
             <w:tcW w:type="dxa" w:w="2880"/>
           </w:tcPr>
           <w:p>
-            <w:r/>
             <w:r>
-              <w:rPr>
-                <w:sz w:val="19"/>
-              </w:rPr>
-              <w:t>RuleEngine, BorrowingRule (+visible), CartItem, RuleConfigForm, cart.html, data.sql</w:t>
+              <w:t>SecurityConfig, AuthController, CustomUserDetailsService, UserService, AdminController, PermissionService, RolePermission/Permission, AccountController, users.html, permissions.html, change-password.html, data.sql (tài khoản &amp; quyền)</w:t>
             </w:r>
           </w:p>
         </w:tc>
@@ -453,11 +398,7 @@
             <w:tcW w:type="dxa" w:w="2880"/>
           </w:tcPr>
           <w:p>
-            <w:r/>
             <w:r>
-              <w:rPr>
-                <w:sz w:val="19"/>
-              </w:rPr>
               <w:t>Lê Hà Hải Vân</w:t>
             </w:r>
           </w:p>
@@ -467,12 +408,8 @@
             <w:tcW w:type="dxa" w:w="2880"/>
           </w:tcPr>
           <w:p>
-            <w:r/>
             <w:r>
-              <w:rPr>
-                <w:sz w:val="19"/>
-              </w:rPr>
-              <w:t>Vòng đời phiếu mượn, Lấy sách &amp; Hẹn giờ</w:t>
+              <w:t>Danh mục &amp; Tìm kiếm sách</w:t>
             </w:r>
           </w:p>
         </w:tc>
@@ -481,12 +418,8 @@
             <w:tcW w:type="dxa" w:w="2880"/>
           </w:tcPr>
           <w:p>
-            <w:r/>
             <w:r>
-              <w:rPr>
-                <w:sz w:val="19"/>
-              </w:rPr>
-              <w:t>LoanService, Loan.java, LoanDetail.java, PickupExpiryScheduler, loans-*.html, my-loans.html</w:t>
+              <w:t>BookService, BookRepository, Book.java, home.html, book-detail.html, books.html, book-form.html</w:t>
             </w:r>
           </w:p>
         </w:tc>
@@ -501,7 +434,7 @@
         <w:rPr>
           <w:color w:val="1F3A5F"/>
         </w:rPr>
-        <w:t>2.  Tổng quan 8 tuần</w:t>
+        <w:t>2.  Tổng quan 12 tuần</w:t>
       </w:r>
     </w:p>
     <w:tbl>
@@ -522,12 +455,7 @@
             <w:tcW w:type="dxa" w:w="2880"/>
           </w:tcPr>
           <w:p>
-            <w:r/>
             <w:r>
-              <w:rPr>
-                <w:b/>
-                <w:sz w:val="20"/>
-              </w:rPr>
               <w:t>Tuần</w:t>
             </w:r>
           </w:p>
@@ -537,12 +465,7 @@
             <w:tcW w:type="dxa" w:w="2880"/>
           </w:tcPr>
           <w:p>
-            <w:r/>
             <w:r>
-              <w:rPr>
-                <w:b/>
-                <w:sz w:val="20"/>
-              </w:rPr>
               <w:t>Giai đoạn</w:t>
             </w:r>
           </w:p>
@@ -552,12 +475,7 @@
             <w:tcW w:type="dxa" w:w="2880"/>
           </w:tcPr>
           <w:p>
-            <w:r/>
             <w:r>
-              <w:rPr>
-                <w:b/>
-                <w:sz w:val="20"/>
-              </w:rPr>
               <w:t>Mốc chính của cả nhóm</w:t>
             </w:r>
           </w:p>
@@ -569,11 +487,7 @@
             <w:tcW w:type="dxa" w:w="2880"/>
           </w:tcPr>
           <w:p>
-            <w:r/>
             <w:r>
-              <w:rPr>
-                <w:sz w:val="19"/>
-              </w:rPr>
               <w:t>1</w:t>
             </w:r>
           </w:p>
@@ -583,11 +497,7 @@
             <w:tcW w:type="dxa" w:w="2880"/>
           </w:tcPr>
           <w:p>
-            <w:r/>
             <w:r>
-              <w:rPr>
-                <w:sz w:val="19"/>
-              </w:rPr>
               <w:t>Khởi tạo</w:t>
             </w:r>
           </w:p>
@@ -597,12 +507,8 @@
             <w:tcW w:type="dxa" w:w="2880"/>
           </w:tcPr>
           <w:p>
-            <w:r/>
             <w:r>
-              <w:rPr>
-                <w:sz w:val="19"/>
-              </w:rPr>
-              <w:t>Phân tích yêu cầu, thiết kế CSDL &amp; kiến trúc MVC, dựng khung Spring Boot</w:t>
+              <w:t>Phân tích yêu cầu, khảo sát quy trình QT.03.TV.DV, chốt phạm vi dự án</w:t>
             </w:r>
           </w:p>
         </w:tc>
@@ -613,11 +519,7 @@
             <w:tcW w:type="dxa" w:w="2880"/>
           </w:tcPr>
           <w:p>
-            <w:r/>
             <w:r>
-              <w:rPr>
-                <w:sz w:val="19"/>
-              </w:rPr>
               <w:t>2</w:t>
             </w:r>
           </w:p>
@@ -627,12 +529,8 @@
             <w:tcW w:type="dxa" w:w="2880"/>
           </w:tcPr>
           <w:p>
-            <w:r/>
             <w:r>
-              <w:rPr>
-                <w:sz w:val="19"/>
-              </w:rPr>
-              <w:t>Nền tảng</w:t>
+              <w:t>Thiết kế</w:t>
             </w:r>
           </w:p>
         </w:tc>
@@ -641,12 +539,8 @@
             <w:tcW w:type="dxa" w:w="2880"/>
           </w:tcPr>
           <w:p>
-            <w:r/>
             <w:r>
-              <w:rPr>
-                <w:sz w:val="19"/>
-              </w:rPr>
-              <w:t>Entity/enum + repository, cấu hình bảo mật &amp; đăng nhập</w:t>
+              <w:t>Thiết kế CSDL (ERD) &amp; kiến trúc MVC; dựng khung Spring Boot + Bootstrap 5</w:t>
             </w:r>
           </w:p>
         </w:tc>
@@ -657,11 +551,7 @@
             <w:tcW w:type="dxa" w:w="2880"/>
           </w:tcPr>
           <w:p>
-            <w:r/>
             <w:r>
-              <w:rPr>
-                <w:sz w:val="19"/>
-              </w:rPr>
               <w:t>3</w:t>
             </w:r>
           </w:p>
@@ -671,12 +561,8 @@
             <w:tcW w:type="dxa" w:w="2880"/>
           </w:tcPr>
           <w:p>
-            <w:r/>
             <w:r>
-              <w:rPr>
-                <w:sz w:val="19"/>
-              </w:rPr>
-              <w:t>Chức năng cốt lõi</w:t>
+              <w:t>Nền tảng</w:t>
             </w:r>
           </w:p>
         </w:tc>
@@ -685,12 +571,8 @@
             <w:tcW w:type="dxa" w:w="2880"/>
           </w:tcPr>
           <w:p>
-            <w:r/>
             <w:r>
-              <w:rPr>
-                <w:sz w:val="19"/>
-              </w:rPr>
-              <w:t>Tìm kiếm – giỏ sách – RuleEngine – vòng đời phiếu mượn bản đầu</w:t>
+              <w:t>Entity/enum + repository; cấu hình Spring Security &amp; đăng nhập</w:t>
             </w:r>
           </w:p>
         </w:tc>
@@ -701,11 +583,7 @@
             <w:tcW w:type="dxa" w:w="2880"/>
           </w:tcPr>
           <w:p>
-            <w:r/>
             <w:r>
-              <w:rPr>
-                <w:sz w:val="19"/>
-              </w:rPr>
               <w:t>4</w:t>
             </w:r>
           </w:p>
@@ -715,12 +593,8 @@
             <w:tcW w:type="dxa" w:w="2880"/>
           </w:tcPr>
           <w:p>
-            <w:r/>
             <w:r>
-              <w:rPr>
-                <w:sz w:val="19"/>
-              </w:rPr>
-              <w:t>Hoàn thiện bản 1</w:t>
+              <w:t>Cốt lõi (I)</w:t>
             </w:r>
           </w:p>
         </w:tc>
@@ -729,12 +603,8 @@
             <w:tcW w:type="dxa" w:w="2880"/>
           </w:tcPr>
           <w:p>
-            <w:r/>
             <w:r>
-              <w:rPr>
-                <w:sz w:val="19"/>
-              </w:rPr>
-              <w:t>Mượn/trả/gia hạn, dashboard, giao diện; demo giữa kỳ</w:t>
+              <w:t>Tìm kiếm danh mục, giỏ sách, RuleEngine bản đầu</w:t>
             </w:r>
           </w:p>
         </w:tc>
@@ -745,11 +615,7 @@
             <w:tcW w:type="dxa" w:w="2880"/>
           </w:tcPr>
           <w:p>
-            <w:r/>
             <w:r>
-              <w:rPr>
-                <w:sz w:val="19"/>
-              </w:rPr>
               <w:t>5</w:t>
             </w:r>
           </w:p>
@@ -759,12 +625,8 @@
             <w:tcW w:type="dxa" w:w="2880"/>
           </w:tcPr>
           <w:p>
-            <w:r/>
             <w:r>
-              <w:rPr>
-                <w:sz w:val="19"/>
-              </w:rPr>
-              <w:t>Tái thiết kế</w:t>
+              <w:t>Cốt lõi (II)</w:t>
             </w:r>
           </w:p>
         </w:tc>
@@ -773,12 +635,8 @@
             <w:tcW w:type="dxa" w:w="2880"/>
           </w:tcPr>
           <w:p>
-            <w:r/>
             <w:r>
-              <w:rPr>
-                <w:sz w:val="19"/>
-              </w:rPr>
-              <w:t>Theo nhận xét GV: trạng thái mới, mã mượn, hạn lấy 24h</w:t>
+              <w:t>Vòng đời phiếu mượn bản đầu (mô hình có duyệt), dashboard</w:t>
             </w:r>
           </w:p>
         </w:tc>
@@ -789,11 +647,7 @@
             <w:tcW w:type="dxa" w:w="2880"/>
           </w:tcPr>
           <w:p>
-            <w:r/>
             <w:r>
-              <w:rPr>
-                <w:sz w:val="19"/>
-              </w:rPr>
               <w:t>6</w:t>
             </w:r>
           </w:p>
@@ -803,12 +657,8 @@
             <w:tcW w:type="dxa" w:w="2880"/>
           </w:tcPr>
           <w:p>
-            <w:r/>
             <w:r>
-              <w:rPr>
-                <w:sz w:val="19"/>
-              </w:rPr>
-              <w:t>Tự phục vụ</w:t>
+              <w:t>Hoàn thiện bản 1</w:t>
             </w:r>
           </w:p>
         </w:tc>
@@ -817,12 +667,8 @@
             <w:tcW w:type="dxa" w:w="2880"/>
           </w:tcPr>
           <w:p>
-            <w:r/>
             <w:r>
-              <w:rPr>
-                <w:sz w:val="19"/>
-              </w:rPr>
-              <w:t>SV tự xác nhận bằng mã mượn; job tự huỷ; bỏ bước duyệt</w:t>
+              <w:t>Mượn/trả/gia hạn, giao diện; demo giữa kỳ (v2)</w:t>
             </w:r>
           </w:p>
         </w:tc>
@@ -833,11 +679,7 @@
             <w:tcW w:type="dxa" w:w="2880"/>
           </w:tcPr>
           <w:p>
-            <w:r/>
             <w:r>
-              <w:rPr>
-                <w:sz w:val="19"/>
-              </w:rPr>
               <w:t>7</w:t>
             </w:r>
           </w:p>
@@ -847,12 +689,8 @@
             <w:tcW w:type="dxa" w:w="2880"/>
           </w:tcPr>
           <w:p>
-            <w:r/>
             <w:r>
-              <w:rPr>
-                <w:sz w:val="19"/>
-              </w:rPr>
-              <w:t>Phân quyền</w:t>
+              <w:t>Tái thiết kế</w:t>
             </w:r>
           </w:p>
         </w:tc>
@@ -861,12 +699,8 @@
             <w:tcW w:type="dxa" w:w="2880"/>
           </w:tcPr>
           <w:p>
-            <w:r/>
             <w:r>
-              <w:rPr>
-                <w:sz w:val="19"/>
-              </w:rPr>
-              <w:t>Tách Admin/Thủ thư; trang cấu hình quy tắc + ẩn/hiện loại tài liệu</w:t>
+              <w:t>Theo nhận xét GV: trạng thái mới, mã lấy sách, hạn lấy 24h</w:t>
             </w:r>
           </w:p>
         </w:tc>
@@ -877,11 +711,7 @@
             <w:tcW w:type="dxa" w:w="2880"/>
           </w:tcPr>
           <w:p>
-            <w:r/>
             <w:r>
-              <w:rPr>
-                <w:sz w:val="19"/>
-              </w:rPr>
               <w:t>8</w:t>
             </w:r>
           </w:p>
@@ -891,11 +721,135 @@
             <w:tcW w:type="dxa" w:w="2880"/>
           </w:tcPr>
           <w:p>
-            <w:r/>
             <w:r>
-              <w:rPr>
-                <w:sz w:val="19"/>
-              </w:rPr>
+              <w:t>Tự phục vụ</w:t>
+            </w:r>
+          </w:p>
+        </w:tc>
+        <w:tc>
+          <w:tcPr>
+            <w:tcW w:type="dxa" w:w="2880"/>
+          </w:tcPr>
+          <w:p>
+            <w:r>
+              <w:t>Bỏ bước duyệt; bạn đọc tự xác nhận bằng mã; job tự huỷ sau 24h</w:t>
+            </w:r>
+          </w:p>
+        </w:tc>
+      </w:tr>
+      <w:tr>
+        <w:tc>
+          <w:tcPr>
+            <w:tcW w:type="dxa" w:w="2880"/>
+          </w:tcPr>
+          <w:p>
+            <w:r>
+              <w:t>9</w:t>
+            </w:r>
+          </w:p>
+        </w:tc>
+        <w:tc>
+          <w:tcPr>
+            <w:tcW w:type="dxa" w:w="2880"/>
+          </w:tcPr>
+          <w:p>
+            <w:r>
+              <w:t>Tách quyền</w:t>
+            </w:r>
+          </w:p>
+        </w:tc>
+        <w:tc>
+          <w:tcPr>
+            <w:tcW w:type="dxa" w:w="2880"/>
+          </w:tcPr>
+          <w:p>
+            <w:r>
+              <w:t>Tách Admin/Thủ thư; ma trận phân quyền chức năng trên giao diện</w:t>
+            </w:r>
+          </w:p>
+        </w:tc>
+      </w:tr>
+      <w:tr>
+        <w:tc>
+          <w:tcPr>
+            <w:tcW w:type="dxa" w:w="2880"/>
+          </w:tcPr>
+          <w:p>
+            <w:r>
+              <w:t>10</w:t>
+            </w:r>
+          </w:p>
+        </w:tc>
+        <w:tc>
+          <w:tcPr>
+            <w:tcW w:type="dxa" w:w="2880"/>
+          </w:tcPr>
+          <w:p>
+            <w:r>
+              <w:t>Cấu hình &amp; mở rộng</w:t>
+            </w:r>
+          </w:p>
+        </w:tc>
+        <w:tc>
+          <w:tcPr>
+            <w:tcW w:type="dxa" w:w="2880"/>
+          </w:tcPr>
+          <w:p>
+            <w:r>
+              <w:t>Trang cấu hình quy tắc + ẩn/hiện loại TL; thông báo in-app; đọc tại chỗ</w:t>
+            </w:r>
+          </w:p>
+        </w:tc>
+      </w:tr>
+      <w:tr>
+        <w:tc>
+          <w:tcPr>
+            <w:tcW w:type="dxa" w:w="2880"/>
+          </w:tcPr>
+          <w:p>
+            <w:r>
+              <w:t>11</w:t>
+            </w:r>
+          </w:p>
+        </w:tc>
+        <w:tc>
+          <w:tcPr>
+            <w:tcW w:type="dxa" w:w="2880"/>
+          </w:tcPr>
+          <w:p>
+            <w:r>
+              <w:t>Sửa lỗi &amp; nâng cấp</w:t>
+            </w:r>
+          </w:p>
+        </w:tc>
+        <w:tc>
+          <w:tcPr>
+            <w:tcW w:type="dxa" w:w="2880"/>
+          </w:tcPr>
+          <w:p>
+            <w:r>
+              <w:t>Sửa 2 lỗi logic; thu phí &amp; COMPLETED; tự đổi mật khẩu; nâng Spring Boot 3.4.13</w:t>
+            </w:r>
+          </w:p>
+        </w:tc>
+      </w:tr>
+      <w:tr>
+        <w:tc>
+          <w:tcPr>
+            <w:tcW w:type="dxa" w:w="2880"/>
+          </w:tcPr>
+          <w:p>
+            <w:r>
+              <w:t>12</w:t>
+            </w:r>
+          </w:p>
+        </w:tc>
+        <w:tc>
+          <w:tcPr>
+            <w:tcW w:type="dxa" w:w="2880"/>
+          </w:tcPr>
+          <w:p>
+            <w:r>
               <w:t>Rà soát &amp; bàn giao</w:t>
             </w:r>
           </w:p>
@@ -905,12 +859,8 @@
             <w:tcW w:type="dxa" w:w="2880"/>
           </w:tcPr>
           <w:p>
-            <w:r/>
             <w:r>
-              <w:rPr>
-                <w:sz w:val="19"/>
-              </w:rPr>
-              <w:t>Sửa lỗi logic, nâng Spring Boot 3.4.13, kiểm thử end-to-end, viết báo cáo</w:t>
+              <w:t>Kiểm thử end-to-end; hoàn thiện báo cáo song ngữ (EN/VI); bàn giao</w:t>
             </w:r>
           </w:p>
         </w:tc>
@@ -936,7 +886,7 @@
         <w:rPr>
           <w:color w:val="1F3A5F"/>
         </w:rPr>
-        <w:t>3.1  Nguyễn Thị Thu Hà — Xác thực, Người dùng &amp; Phân quyền</w:t>
+        <w:t>3.1  Nguyễn Thị Thu Hà — Vòng đời phiếu mượn, Lấy sách &amp; Lập lịch</w:t>
       </w:r>
     </w:p>
     <w:tbl>
@@ -956,12 +906,7 @@
             <w:tcW w:type="dxa" w:w="4320"/>
           </w:tcPr>
           <w:p>
-            <w:r/>
             <w:r>
-              <w:rPr>
-                <w:b/>
-                <w:sz w:val="20"/>
-              </w:rPr>
               <w:t>Tuần</w:t>
             </w:r>
           </w:p>
@@ -971,12 +916,7 @@
             <w:tcW w:type="dxa" w:w="4320"/>
           </w:tcPr>
           <w:p>
-            <w:r/>
             <w:r>
-              <w:rPr>
-                <w:b/>
-                <w:sz w:val="20"/>
-              </w:rPr>
               <w:t>Công việc chính</w:t>
             </w:r>
           </w:p>
@@ -988,11 +928,7 @@
             <w:tcW w:type="dxa" w:w="4320"/>
           </w:tcPr>
           <w:p>
-            <w:r/>
             <w:r>
-              <w:rPr>
-                <w:sz w:val="19"/>
-              </w:rPr>
               <w:t>1</w:t>
             </w:r>
           </w:p>
@@ -1002,12 +938,8 @@
             <w:tcW w:type="dxa" w:w="4320"/>
           </w:tcPr>
           <w:p>
-            <w:r/>
             <w:r>
-              <w:rPr>
-                <w:sz w:val="19"/>
-              </w:rPr>
-              <w:t>Tham gia phân tích yêu cầu; thiết kế bảng users và sơ đồ vai trò; chọn cơ chế bảo mật (form login + BCrypt).</w:t>
+              <w:t>Phân tích vòng đời phiếu mượn; thiết kế bảng loans/loan_details và các enum trạng thái.</w:t>
             </w:r>
           </w:p>
         </w:tc>
@@ -1018,11 +950,7 @@
             <w:tcW w:type="dxa" w:w="4320"/>
           </w:tcPr>
           <w:p>
-            <w:r/>
             <w:r>
-              <w:rPr>
-                <w:sz w:val="19"/>
-              </w:rPr>
               <w:t>2</w:t>
             </w:r>
           </w:p>
@@ -1032,12 +960,8 @@
             <w:tcW w:type="dxa" w:w="4320"/>
           </w:tcPr>
           <w:p>
-            <w:r/>
             <w:r>
-              <w:rPr>
-                <w:sz w:val="19"/>
-              </w:rPr>
-              <w:t>Tạo entity User, enum UserRole/CardStatus; UserRepository.findByStudentCode; cấu hình SecurityConfig + CustomUserDetailsService.</w:t>
+              <w:t>Entity Loan/LoanDetail + hàm hỗ trợ (isOverdue, getDaysRemaining…); LoanRepository, LoanDetailRepository.</w:t>
             </w:r>
           </w:p>
         </w:tc>
@@ -1048,11 +972,7 @@
             <w:tcW w:type="dxa" w:w="4320"/>
           </w:tcPr>
           <w:p>
-            <w:r/>
             <w:r>
-              <w:rPr>
-                <w:sz w:val="19"/>
-              </w:rPr>
               <w:t>3</w:t>
             </w:r>
           </w:p>
@@ -1062,12 +982,8 @@
             <w:tcW w:type="dxa" w:w="4320"/>
           </w:tcPr>
           <w:p>
-            <w:r/>
             <w:r>
-              <w:rPr>
-                <w:sz w:val="19"/>
-              </w:rPr>
-              <w:t>Trang đăng nhập login.html; AuthController điều hướng theo vai trò; UserService.findAll/toggleCardStatus.</w:t>
+              <w:t>LoanService bản đầu (submitLoan, approveLoan, returnBook, renewBook) theo mô hình có duyệt.</w:t>
             </w:r>
           </w:p>
         </w:tc>
@@ -1078,11 +994,7 @@
             <w:tcW w:type="dxa" w:w="4320"/>
           </w:tcPr>
           <w:p>
-            <w:r/>
             <w:r>
-              <w:rPr>
-                <w:sz w:val="19"/>
-              </w:rPr>
               <w:t>4</w:t>
             </w:r>
           </w:p>
@@ -1092,12 +1004,8 @@
             <w:tcW w:type="dxa" w:w="4320"/>
           </w:tcPr>
           <w:p>
-            <w:r/>
             <w:r>
-              <w:rPr>
-                <w:sz w:val="19"/>
-              </w:rPr>
-              <w:t>Trang quản lý người dùng users.html (khoá/mở thẻ); trang lỗi 403/404; kiểm thử đăng nhập.</w:t>
+              <w:t>Dashboard thống kê; trang loans-pending/loans-active.</w:t>
             </w:r>
           </w:p>
         </w:tc>
@@ -1108,11 +1016,7 @@
             <w:tcW w:type="dxa" w:w="4320"/>
           </w:tcPr>
           <w:p>
-            <w:r/>
             <w:r>
-              <w:rPr>
-                <w:sz w:val="19"/>
-              </w:rPr>
               <w:t>5</w:t>
             </w:r>
           </w:p>
@@ -1122,12 +1026,8 @@
             <w:tcW w:type="dxa" w:w="4320"/>
           </w:tcPr>
           <w:p>
-            <w:r/>
             <w:r>
-              <w:rPr>
-                <w:sz w:val="19"/>
-              </w:rPr>
-              <w:t>Bổ sung vai trò LIBRARIAN; thiết kế phương án tách quyền Admin và Thủ thư.</w:t>
+              <w:t>Trang my-loans; tính phí trễ &amp; gia hạn; hoàn thiện luồng mượn–trả bản 1.</w:t>
             </w:r>
           </w:p>
         </w:tc>
@@ -1138,11 +1038,7 @@
             <w:tcW w:type="dxa" w:w="4320"/>
           </w:tcPr>
           <w:p>
-            <w:r/>
             <w:r>
-              <w:rPr>
-                <w:sz w:val="19"/>
-              </w:rPr>
               <w:t>6</w:t>
             </w:r>
           </w:p>
@@ -1152,12 +1048,8 @@
             <w:tcW w:type="dxa" w:w="4320"/>
           </w:tcPr>
           <w:p>
-            <w:r/>
             <w:r>
-              <w:rPr>
-                <w:sz w:val="19"/>
-              </w:rPr>
-              <w:t>Viết lại phân quyền trong SecurityConfig (users/config → ADMIN, còn lại → LIBRARIAN), bỏ role hierarchy; sửa điều hướng đăng nhập (admin→users, librarian→dashboard).</w:t>
+              <w:t>Tinh chỉnh giao diện phiếu mượn; chuẩn bị demo giữa kỳ (v2).</w:t>
             </w:r>
           </w:p>
         </w:tc>
@@ -1168,11 +1060,7 @@
             <w:tcW w:type="dxa" w:w="4320"/>
           </w:tcPr>
           <w:p>
-            <w:r/>
             <w:r>
-              <w:rPr>
-                <w:sz w:val="19"/>
-              </w:rPr>
               <w:t>7</w:t>
             </w:r>
           </w:p>
@@ -1182,12 +1070,8 @@
             <w:tcW w:type="dxa" w:w="4320"/>
           </w:tcPr>
           <w:p>
-            <w:r/>
             <w:r>
-              <w:rPr>
-                <w:sz w:val="19"/>
-              </w:rPr>
-              <w:t>Tạo tài khoản &amp; gán vai trò trên UI (UserService.create, POST /admin/users); dựng RuleService (findAllOrdered/visibleDocTypes/updateRules) và trang config.html.</w:t>
+              <w:t>Thiết kế lại trạng thái AWAITING_PICKUP/BORROWED/COMPLETED/CANCELLED + RESERVED; thêm pickup_code/pickup_deadline/picked_up_at; submitLoan sinh mã 6 ký tự + hạn 24h.</w:t>
             </w:r>
           </w:p>
         </w:tc>
@@ -1198,11 +1082,7 @@
             <w:tcW w:type="dxa" w:w="4320"/>
           </w:tcPr>
           <w:p>
-            <w:r/>
             <w:r>
-              <w:rPr>
-                <w:sz w:val="19"/>
-              </w:rPr>
               <w:t>8</w:t>
             </w:r>
           </w:p>
@@ -1212,12 +1092,96 @@
             <w:tcW w:type="dxa" w:w="4320"/>
           </w:tcPr>
           <w:p>
-            <w:r/>
             <w:r>
-              <w:rPr>
-                <w:sz w:val="19"/>
-              </w:rPr>
-              <w:t>Kiểm thử phân quyền (200/403), seed tài khoản librarian01, rà soát bảo mật; viết phần báo cáo tương ứng.</w:t>
+              <w:t>confirmPickup (bạn đọc tự nhập mã → BORROWED), bỏ bước duyệt; PickupExpiryScheduler + @EnableScheduling (cancelExpiredPickups tự huỷ sau 24h).</w:t>
+            </w:r>
+          </w:p>
+        </w:tc>
+      </w:tr>
+      <w:tr>
+        <w:tc>
+          <w:tcPr>
+            <w:tcW w:type="dxa" w:w="4320"/>
+          </w:tcPr>
+          <w:p>
+            <w:r>
+              <w:t>9</w:t>
+            </w:r>
+          </w:p>
+        </w:tc>
+        <w:tc>
+          <w:tcPr>
+            <w:tcW w:type="dxa" w:w="4320"/>
+          </w:tcPr>
+          <w:p>
+            <w:r>
+              <w:t>cancelLoan/cancelByReader (huỷ kèm lý do, hoàn số lượng); cập nhật my-loans ('Đơn chờ lấy' + ô nhập mã) và loans.html (bỏ nút duyệt, chỉ chuẩn bị sách).</w:t>
+            </w:r>
+          </w:p>
+        </w:tc>
+      </w:tr>
+      <w:tr>
+        <w:tc>
+          <w:tcPr>
+            <w:tcW w:type="dxa" w:w="4320"/>
+          </w:tcPr>
+          <w:p>
+            <w:r>
+              <w:t>10</w:t>
+            </w:r>
+          </w:p>
+        </w:tc>
+        <w:tc>
+          <w:tcPr>
+            <w:tcW w:type="dxa" w:w="4320"/>
+          </w:tcPr>
+          <w:p>
+            <w:r>
+              <w:t>NotificationService (notify/notifyRole) + Notification.java + notifications.html (chuông navbar); lendInHouse + inhouse.html (đọc tại chỗ) trong LibrarianController.</w:t>
+            </w:r>
+          </w:p>
+        </w:tc>
+      </w:tr>
+      <w:tr>
+        <w:tc>
+          <w:tcPr>
+            <w:tcW w:type="dxa" w:w="4320"/>
+          </w:tcPr>
+          <w:p>
+            <w:r>
+              <w:t>11</w:t>
+            </w:r>
+          </w:p>
+        </w:tc>
+        <w:tc>
+          <w:tcPr>
+            <w:tcW w:type="dxa" w:w="4320"/>
+          </w:tcPr>
+          <w:p>
+            <w:r>
+              <w:t>Sửa lỗi giữ chỗ trong submitLoan (kiểm tra tồn kho trước khi trừ); payFine + finePaid → refreshCompletion (COMPLETED); sendDueReminders.</w:t>
+            </w:r>
+          </w:p>
+        </w:tc>
+      </w:tr>
+      <w:tr>
+        <w:tc>
+          <w:tcPr>
+            <w:tcW w:type="dxa" w:w="4320"/>
+          </w:tcPr>
+          <w:p>
+            <w:r>
+              <w:t>12</w:t>
+            </w:r>
+          </w:p>
+        </w:tc>
+        <w:tc>
+          <w:tcPr>
+            <w:tcW w:type="dxa" w:w="4320"/>
+          </w:tcPr>
+          <w:p>
+            <w:r>
+              <w:t>Kiểm thử end-to-end (mượn→nhập mã→đang mượn, sai mã, tự huỷ, thu phí, đọc tại chỗ); viết phần báo cáo tương ứng.</w:t>
             </w:r>
           </w:p>
         </w:tc>
@@ -1232,7 +1196,7 @@
         <w:rPr>
           <w:color w:val="1F3A5F"/>
         </w:rPr>
-        <w:t>3.2  Bùi Thanh Thảo — Danh mục &amp; Tìm kiếm sách</w:t>
+        <w:t>3.2  Bùi Thanh Thảo — Quy tắc mượn, Ẩn/hiện &amp; Giỏ sách</w:t>
       </w:r>
     </w:p>
     <w:tbl>
@@ -1252,12 +1216,7 @@
             <w:tcW w:type="dxa" w:w="4320"/>
           </w:tcPr>
           <w:p>
-            <w:r/>
             <w:r>
-              <w:rPr>
-                <w:b/>
-                <w:sz w:val="20"/>
-              </w:rPr>
               <w:t>Tuần</w:t>
             </w:r>
           </w:p>
@@ -1267,12 +1226,7 @@
             <w:tcW w:type="dxa" w:w="4320"/>
           </w:tcPr>
           <w:p>
-            <w:r/>
             <w:r>
-              <w:rPr>
-                <w:b/>
-                <w:sz w:val="20"/>
-              </w:rPr>
               <w:t>Công việc chính</w:t>
             </w:r>
           </w:p>
@@ -1284,11 +1238,7 @@
             <w:tcW w:type="dxa" w:w="4320"/>
           </w:tcPr>
           <w:p>
-            <w:r/>
             <w:r>
-              <w:rPr>
-                <w:sz w:val="19"/>
-              </w:rPr>
               <w:t>1</w:t>
             </w:r>
           </w:p>
@@ -1298,12 +1248,8 @@
             <w:tcW w:type="dxa" w:w="4320"/>
           </w:tcPr>
           <w:p>
-            <w:r/>
             <w:r>
-              <w:rPr>
-                <w:sz w:val="19"/>
-              </w:rPr>
-              <w:t>Phân tích yêu cầu tra cứu; thiết kế bảng books và 4 loại tài liệu (DocType).</w:t>
+              <w:t>Phân tích quy định QT.03.TV.DV; lập ma trận 12 quy tắc; thiết kế bảng borrowing_rules.</w:t>
             </w:r>
           </w:p>
         </w:tc>
@@ -1314,11 +1260,7 @@
             <w:tcW w:type="dxa" w:w="4320"/>
           </w:tcPr>
           <w:p>
-            <w:r/>
             <w:r>
-              <w:rPr>
-                <w:sz w:val="19"/>
-              </w:rPr>
               <w:t>2</w:t>
             </w:r>
           </w:p>
@@ -1328,12 +1270,8 @@
             <w:tcW w:type="dxa" w:w="4320"/>
           </w:tcPr>
           <w:p>
-            <w:r/>
             <w:r>
-              <w:rPr>
-                <w:sz w:val="19"/>
-              </w:rPr>
-              <w:t>Entity Book + enum DocType/BookCondition; BookRepository.searchBooks (LIKE theo tiêu đề/tác giả/ISBN/mã phân loại).</w:t>
+              <w:t>Entity BorrowingRule (unique user_role + doc_type); BorrowingRuleRepository.</w:t>
             </w:r>
           </w:p>
         </w:tc>
@@ -1344,11 +1282,7 @@
             <w:tcW w:type="dxa" w:w="4320"/>
           </w:tcPr>
           <w:p>
-            <w:r/>
             <w:r>
-              <w:rPr>
-                <w:sz w:val="19"/>
-              </w:rPr>
               <w:t>3</w:t>
             </w:r>
           </w:p>
@@ -1358,12 +1292,8 @@
             <w:tcW w:type="dxa" w:w="4320"/>
           </w:tcPr>
           <w:p>
-            <w:r/>
             <w:r>
-              <w:rPr>
-                <w:sz w:val="19"/>
-              </w:rPr>
-              <w:t>BookService (search, CRUD, toForm); trang chủ tìm kiếm home.html (từ khoá, lọc loại, lọc còn sẵn).</w:t>
+              <w:t>Seed data.sql 12 quy tắc theo từng đối tượng; DTO CartItem.</w:t>
             </w:r>
           </w:p>
         </w:tc>
@@ -1374,11 +1304,7 @@
             <w:tcW w:type="dxa" w:w="4320"/>
           </w:tcPr>
           <w:p>
-            <w:r/>
             <w:r>
-              <w:rPr>
-                <w:sz w:val="19"/>
-              </w:rPr>
               <w:t>4</w:t>
             </w:r>
           </w:p>
@@ -1388,12 +1314,8 @@
             <w:tcW w:type="dxa" w:w="4320"/>
           </w:tcPr>
           <w:p>
-            <w:r/>
             <w:r>
-              <w:rPr>
-                <w:sz w:val="19"/>
-              </w:rPr>
-              <w:t>Trang chi tiết sách book-detail.html; trang quản lý books.html và form book-form.html (thêm/sửa/xoá, chọn DocType).</w:t>
+              <w:t>RuleEngine: validate 3 tầng (thẻ/quá hạn/hạn mức), calculateDueDate, canRenew, calculateFine.</w:t>
             </w:r>
           </w:p>
         </w:tc>
@@ -1404,11 +1326,7 @@
             <w:tcW w:type="dxa" w:w="4320"/>
           </w:tcPr>
           <w:p>
-            <w:r/>
             <w:r>
-              <w:rPr>
-                <w:sz w:val="19"/>
-              </w:rPr>
               <w:t>5</w:t>
             </w:r>
           </w:p>
@@ -1418,12 +1336,8 @@
             <w:tcW w:type="dxa" w:w="4320"/>
           </w:tcPr>
           <w:p>
-            <w:r/>
             <w:r>
-              <w:rPr>
-                <w:sz w:val="19"/>
-              </w:rPr>
-              <w:t>Phối hợp đưa cơ chế ẩn/hiện vào tìm kiếm: thêm hàm search có lọc theo tập loại tài liệu được phép xem.</w:t>
+              <w:t>Endpoint giỏ trong session (add/remove/clear); trang giỏ cart.html; hiển thị lỗi điều kiện.</w:t>
             </w:r>
           </w:p>
         </w:tc>
@@ -1434,11 +1348,7 @@
             <w:tcW w:type="dxa" w:w="4320"/>
           </w:tcPr>
           <w:p>
-            <w:r/>
             <w:r>
-              <w:rPr>
-                <w:sz w:val="19"/>
-              </w:rPr>
               <w:t>6</w:t>
             </w:r>
           </w:p>
@@ -1448,12 +1358,8 @@
             <w:tcW w:type="dxa" w:w="4320"/>
           </w:tcPr>
           <w:p>
-            <w:r/>
             <w:r>
-              <w:rPr>
-                <w:sz w:val="19"/>
-              </w:rPr>
-              <w:t>Cập nhật home/book-detail để chỉ hiển thị loại tài liệu được phép với vai trò; xử lý ảnh bìa/placeholder.</w:t>
+              <w:t>Hoàn thiện dữ liệu mẫu &amp; thông điệp kiểm tra; demo giữa kỳ (v2).</w:t>
             </w:r>
           </w:p>
         </w:tc>
@@ -1464,11 +1370,7 @@
             <w:tcW w:type="dxa" w:w="4320"/>
           </w:tcPr>
           <w:p>
-            <w:r/>
             <w:r>
-              <w:rPr>
-                <w:sz w:val="19"/>
-              </w:rPr>
               <w:t>7</w:t>
             </w:r>
           </w:p>
@@ -1478,12 +1380,8 @@
             <w:tcW w:type="dxa" w:w="4320"/>
           </w:tcPr>
           <w:p>
-            <w:r/>
             <w:r>
-              <w:rPr>
-                <w:sz w:val="19"/>
-              </w:rPr>
-              <w:t>Chuyển quản lý sách &amp; số lượng sang khu Thủ thư (route/navbar); phối hợp chặn thêm vào giỏ với loại đang bị ẩn.</w:t>
+              <w:t>Phối hợp định nghĩa trạng thái/luồng mới với phần phiếu mượn.</w:t>
             </w:r>
           </w:p>
         </w:tc>
@@ -1494,11 +1392,7 @@
             <w:tcW w:type="dxa" w:w="4320"/>
           </w:tcPr>
           <w:p>
-            <w:r/>
             <w:r>
-              <w:rPr>
-                <w:sz w:val="19"/>
-              </w:rPr>
               <w:t>8</w:t>
             </w:r>
           </w:p>
@@ -1508,12 +1402,96 @@
             <w:tcW w:type="dxa" w:w="4320"/>
           </w:tcPr>
           <w:p>
-            <w:r/>
             <w:r>
-              <w:rPr>
-                <w:sz w:val="19"/>
-              </w:rPr>
-              <w:t>Kiểm thử tìm kiếm/lọc/CRUD; tinh chỉnh giao diện Bootstrap; viết phần báo cáo tương ứng.</w:t>
+              <w:t>Thêm cột visible vào BorrowingRule; cập nhật data.sql (visible=TRUE cho 12 dòng); kiểm tra visible trong validate (chặn mượn loại bị ẩn).</w:t>
+            </w:r>
+          </w:p>
+        </w:tc>
+      </w:tr>
+      <w:tr>
+        <w:tc>
+          <w:tcPr>
+            <w:tcW w:type="dxa" w:w="4320"/>
+          </w:tcPr>
+          <w:p>
+            <w:r>
+              <w:t>9</w:t>
+            </w:r>
+          </w:p>
+        </w:tc>
+        <w:tc>
+          <w:tcPr>
+            <w:tcW w:type="dxa" w:w="4320"/>
+          </w:tcPr>
+          <w:p>
+            <w:r>
+              <w:t>Bổ sung 6 lớp kiểm tra giỏ: quyền BORROW · trùng · ≤5 · không RESTRICTED · được phép xem · còn sẵn.</w:t>
+            </w:r>
+          </w:p>
+        </w:tc>
+      </w:tr>
+      <w:tr>
+        <w:tc>
+          <w:tcPr>
+            <w:tcW w:type="dxa" w:w="4320"/>
+          </w:tcPr>
+          <w:p>
+            <w:r>
+              <w:t>10</w:t>
+            </w:r>
+          </w:p>
+        </w:tc>
+        <w:tc>
+          <w:tcPr>
+            <w:tcW w:type="dxa" w:w="4320"/>
+          </w:tcPr>
+          <w:p>
+            <w:r>
+              <w:t>RuleService (findAllOrdered/visibleDocTypes/updateRules) + RuleConfigForm; trang rules.html (sửa hạn mức/thời hạn/gia hạn + công tắc hiển thị).</w:t>
+            </w:r>
+          </w:p>
+        </w:tc>
+      </w:tr>
+      <w:tr>
+        <w:tc>
+          <w:tcPr>
+            <w:tcW w:type="dxa" w:w="4320"/>
+          </w:tcPr>
+          <w:p>
+            <w:r>
+              <w:t>11</w:t>
+            </w:r>
+          </w:p>
+        </w:tc>
+        <w:tc>
+          <w:tcPr>
+            <w:tcW w:type="dxa" w:w="4320"/>
+          </w:tcPr>
+          <w:p>
+            <w:r>
+              <w:t>Sửa lỗi tính phí (ChronoUnit.DAYS thay Period.getDays); chuẩn hoá giới hạn giỏ và thông điệp tiếng Việt.</w:t>
+            </w:r>
+          </w:p>
+        </w:tc>
+      </w:tr>
+      <w:tr>
+        <w:tc>
+          <w:tcPr>
+            <w:tcW w:type="dxa" w:w="4320"/>
+          </w:tcPr>
+          <w:p>
+            <w:r>
+              <w:t>12</w:t>
+            </w:r>
+          </w:p>
+        </w:tc>
+        <w:tc>
+          <w:tcPr>
+            <w:tcW w:type="dxa" w:w="4320"/>
+          </w:tcPr>
+          <w:p>
+            <w:r>
+              <w:t>Kiểm thử quota &amp; ẩn/hiện loại tài liệu; viết phần báo cáo tương ứng.</w:t>
             </w:r>
           </w:p>
         </w:tc>
@@ -1528,7 +1506,7 @@
         <w:rPr>
           <w:color w:val="1F3A5F"/>
         </w:rPr>
-        <w:t>3.3  Phạm Minh Tuyên — Quy tắc mượn, Ẩn/hiện &amp; Giỏ sách</w:t>
+        <w:t>3.3  Phạm Minh Tuyên — Xác thực, Người dùng &amp; Phân quyền</w:t>
       </w:r>
     </w:p>
     <w:tbl>
@@ -1548,12 +1526,7 @@
             <w:tcW w:type="dxa" w:w="4320"/>
           </w:tcPr>
           <w:p>
-            <w:r/>
             <w:r>
-              <w:rPr>
-                <w:b/>
-                <w:sz w:val="20"/>
-              </w:rPr>
               <w:t>Tuần</w:t>
             </w:r>
           </w:p>
@@ -1563,12 +1536,7 @@
             <w:tcW w:type="dxa" w:w="4320"/>
           </w:tcPr>
           <w:p>
-            <w:r/>
             <w:r>
-              <w:rPr>
-                <w:b/>
-                <w:sz w:val="20"/>
-              </w:rPr>
               <w:t>Công việc chính</w:t>
             </w:r>
           </w:p>
@@ -1580,11 +1548,7 @@
             <w:tcW w:type="dxa" w:w="4320"/>
           </w:tcPr>
           <w:p>
-            <w:r/>
             <w:r>
-              <w:rPr>
-                <w:sz w:val="19"/>
-              </w:rPr>
               <w:t>1</w:t>
             </w:r>
           </w:p>
@@ -1594,12 +1558,8 @@
             <w:tcW w:type="dxa" w:w="4320"/>
           </w:tcPr>
           <w:p>
-            <w:r/>
             <w:r>
-              <w:rPr>
-                <w:sz w:val="19"/>
-              </w:rPr>
-              <w:t>Phân tích quy định QT.03.TV.DV; lập ma trận 12 quy tắc; thiết kế bảng borrowing_rules.</w:t>
+              <w:t>Tham gia phân tích yêu cầu; thiết kế bảng users &amp; sơ đồ vai trò; chọn cơ chế bảo mật (form login + BCrypt).</w:t>
             </w:r>
           </w:p>
         </w:tc>
@@ -1610,11 +1570,7 @@
             <w:tcW w:type="dxa" w:w="4320"/>
           </w:tcPr>
           <w:p>
-            <w:r/>
             <w:r>
-              <w:rPr>
-                <w:sz w:val="19"/>
-              </w:rPr>
               <w:t>2</w:t>
             </w:r>
           </w:p>
@@ -1624,12 +1580,8 @@
             <w:tcW w:type="dxa" w:w="4320"/>
           </w:tcPr>
           <w:p>
-            <w:r/>
             <w:r>
-              <w:rPr>
-                <w:sz w:val="19"/>
-              </w:rPr>
-              <w:t>Entity BorrowingRule (unique role+doc_type); BorrowingRuleRepository; seed data.sql (users, books, 12 quy tắc).</w:t>
+              <w:t>Entity User, enum UserRole/CardStatus; UserRepository.findByStudentCode.</w:t>
             </w:r>
           </w:p>
         </w:tc>
@@ -1640,11 +1592,7 @@
             <w:tcW w:type="dxa" w:w="4320"/>
           </w:tcPr>
           <w:p>
-            <w:r/>
             <w:r>
-              <w:rPr>
-                <w:sz w:val="19"/>
-              </w:rPr>
               <w:t>3</w:t>
             </w:r>
           </w:p>
@@ -1654,12 +1602,8 @@
             <w:tcW w:type="dxa" w:w="4320"/>
           </w:tcPr>
           <w:p>
-            <w:r/>
             <w:r>
-              <w:rPr>
-                <w:sz w:val="19"/>
-              </w:rPr>
-              <w:t>RuleEngine: validate 3 tầng, calculateDueDate, canRenew, calculateFine; CartItem DTO; phối hợp endpoint giỏ (add/remove/clear).</w:t>
+              <w:t>Cấu hình SecurityConfig + CustomUserDetailsService; trang login.html; AuthController điều hướng theo vai trò.</w:t>
             </w:r>
           </w:p>
         </w:tc>
@@ -1670,11 +1614,7 @@
             <w:tcW w:type="dxa" w:w="4320"/>
           </w:tcPr>
           <w:p>
-            <w:r/>
             <w:r>
-              <w:rPr>
-                <w:sz w:val="19"/>
-              </w:rPr>
               <w:t>4</w:t>
             </w:r>
           </w:p>
@@ -1684,12 +1624,8 @@
             <w:tcW w:type="dxa" w:w="4320"/>
           </w:tcPr>
           <w:p>
-            <w:r/>
             <w:r>
-              <w:rPr>
-                <w:sz w:val="19"/>
-              </w:rPr>
-              <w:t>Trang giỏ sách cart.html; hiển thị lỗi kiểm tra điều kiện; hoàn thiện dữ liệu mẫu.</w:t>
+              <w:t>UserService.findAll/search/toggleCardStatus; trang quản lý người dùng users.html (khoá/mở thẻ); trang lỗi 403/404.</w:t>
             </w:r>
           </w:p>
         </w:tc>
@@ -1700,11 +1636,7 @@
             <w:tcW w:type="dxa" w:w="4320"/>
           </w:tcPr>
           <w:p>
-            <w:r/>
             <w:r>
-              <w:rPr>
-                <w:sz w:val="19"/>
-              </w:rPr>
               <w:t>5</w:t>
             </w:r>
           </w:p>
@@ -1714,12 +1646,8 @@
             <w:tcW w:type="dxa" w:w="4320"/>
           </w:tcPr>
           <w:p>
-            <w:r/>
             <w:r>
-              <w:rPr>
-                <w:sz w:val="19"/>
-              </w:rPr>
-              <w:t>Thêm cột visible vào BorrowingRule; cập nhật data.sql (visible=TRUE cho 12 dòng, thêm librarian01).</w:t>
+              <w:t>Gắn xác thực vào các luồng nghiệp vụ; resetPassword; kiểm thử đăng nhập theo vai trò.</w:t>
             </w:r>
           </w:p>
         </w:tc>
@@ -1730,11 +1658,7 @@
             <w:tcW w:type="dxa" w:w="4320"/>
           </w:tcPr>
           <w:p>
-            <w:r/>
             <w:r>
-              <w:rPr>
-                <w:sz w:val="19"/>
-              </w:rPr>
               <w:t>6</w:t>
             </w:r>
           </w:p>
@@ -1744,12 +1668,8 @@
             <w:tcW w:type="dxa" w:w="4320"/>
           </w:tcPr>
           <w:p>
-            <w:r/>
             <w:r>
-              <w:rPr>
-                <w:sz w:val="19"/>
-              </w:rPr>
-              <w:t>Tạo RuleConfigForm và logic lưu cấu hình; bổ sung kiểm tra visible trong validate (chặn mượn loại đang bị ẩn).</w:t>
+              <w:t>Rà soát bảo mật cho bản demo v2; chuẩn bị dữ liệu tài khoản mẫu.</w:t>
             </w:r>
           </w:p>
         </w:tc>
@@ -1760,11 +1680,7 @@
             <w:tcW w:type="dxa" w:w="4320"/>
           </w:tcPr>
           <w:p>
-            <w:r/>
             <w:r>
-              <w:rPr>
-                <w:sz w:val="19"/>
-              </w:rPr>
               <w:t>7</w:t>
             </w:r>
           </w:p>
@@ -1774,12 +1690,8 @@
             <w:tcW w:type="dxa" w:w="4320"/>
           </w:tcPr>
           <w:p>
-            <w:r/>
             <w:r>
-              <w:rPr>
-                <w:sz w:val="19"/>
-              </w:rPr>
-              <w:t>Hoàn thiện bảng ma trận trên trang phân quyền (sửa SL tối đa, số ngày mượn, gia hạn, công tắc hiển thị) — phối hợp với Thu Hà.</w:t>
+              <w:t>Bổ sung vai trò LIBRARIAN; thiết kế phương án tách quyền Admin/Thủ thư (bỏ role hierarchy).</w:t>
             </w:r>
           </w:p>
         </w:tc>
@@ -1790,11 +1702,7 @@
             <w:tcW w:type="dxa" w:w="4320"/>
           </w:tcPr>
           <w:p>
-            <w:r/>
             <w:r>
-              <w:rPr>
-                <w:sz w:val="19"/>
-              </w:rPr>
               <w:t>8</w:t>
             </w:r>
           </w:p>
@@ -1804,12 +1712,96 @@
             <w:tcW w:type="dxa" w:w="4320"/>
           </w:tcPr>
           <w:p>
-            <w:r/>
             <w:r>
-              <w:rPr>
-                <w:sz w:val="19"/>
-              </w:rPr>
-              <w:t>Sửa lỗi tính tiền phạt (dùng ChronoUnit thay cho Period.getDays); kiểm thử quota và ẩn/hiện; viết phần báo cáo tương ứng.</w:t>
+              <w:t>Viết lại matcher SecurityConfig (/admin/**→ADMIN, /librarian/**→LIBRARIAN, /client/**→bạn đọc); sửa điều hướng sau đăng nhập.</w:t>
+            </w:r>
+          </w:p>
+        </w:tc>
+      </w:tr>
+      <w:tr>
+        <w:tc>
+          <w:tcPr>
+            <w:tcW w:type="dxa" w:w="4320"/>
+          </w:tcPr>
+          <w:p>
+            <w:r>
+              <w:t>9</w:t>
+            </w:r>
+          </w:p>
+        </w:tc>
+        <w:tc>
+          <w:tcPr>
+            <w:tcW w:type="dxa" w:w="4320"/>
+          </w:tcPr>
+          <w:p>
+            <w:r>
+              <w:t>AdminController + UserService.create (tạo tài khoản, gán vai trò, POST /admin/users); enum Permission + RolePermission + PermissionService (has/grantedFor/updateGrantsForRole).</w:t>
+            </w:r>
+          </w:p>
+        </w:tc>
+      </w:tr>
+      <w:tr>
+        <w:tc>
+          <w:tcPr>
+            <w:tcW w:type="dxa" w:w="4320"/>
+          </w:tcPr>
+          <w:p>
+            <w:r>
+              <w:t>10</w:t>
+            </w:r>
+          </w:p>
+        </w:tc>
+        <w:tc>
+          <w:tcPr>
+            <w:tcW w:type="dxa" w:w="4320"/>
+          </w:tcPr>
+          <w:p>
+            <w:r>
+              <w:t>Trang ma trận phân quyền permissions.html (GET/POST /admin/permissions) bật/tắt quyền theo vai trò.</w:t>
+            </w:r>
+          </w:p>
+        </w:tc>
+      </w:tr>
+      <w:tr>
+        <w:tc>
+          <w:tcPr>
+            <w:tcW w:type="dxa" w:w="4320"/>
+          </w:tcPr>
+          <w:p>
+            <w:r>
+              <w:t>11</w:t>
+            </w:r>
+          </w:p>
+        </w:tc>
+        <w:tc>
+          <w:tcPr>
+            <w:tcW w:type="dxa" w:w="4320"/>
+          </w:tcPr>
+          <w:p>
+            <w:r>
+              <w:t>AccountController + UserService.changePassword + change-password.html (tự đổi mật khẩu mọi vai trò); seed 82 tài khoản &amp; ma trận quyền mặc định trong data.sql.</w:t>
+            </w:r>
+          </w:p>
+        </w:tc>
+      </w:tr>
+      <w:tr>
+        <w:tc>
+          <w:tcPr>
+            <w:tcW w:type="dxa" w:w="4320"/>
+          </w:tcPr>
+          <w:p>
+            <w:r>
+              <w:t>12</w:t>
+            </w:r>
+          </w:p>
+        </w:tc>
+        <w:tc>
+          <w:tcPr>
+            <w:tcW w:type="dxa" w:w="4320"/>
+          </w:tcPr>
+          <w:p>
+            <w:r>
+              <w:t>Kiểm thử phân quyền (200/403) và chốt quyền theo chức năng; rà soát bảo mật; viết phần báo cáo tương ứng.</w:t>
             </w:r>
           </w:p>
         </w:tc>
@@ -1824,7 +1816,7 @@
         <w:rPr>
           <w:color w:val="1F3A5F"/>
         </w:rPr>
-        <w:t>3.4  Lê Hà Hải Vân — Vòng đời phiếu mượn, Lấy sách &amp; Hẹn giờ</w:t>
+        <w:t>3.4  Lê Hà Hải Vân — Danh mục &amp; Tìm kiếm sách</w:t>
       </w:r>
     </w:p>
     <w:tbl>
@@ -1844,12 +1836,7 @@
             <w:tcW w:type="dxa" w:w="4320"/>
           </w:tcPr>
           <w:p>
-            <w:r/>
             <w:r>
-              <w:rPr>
-                <w:b/>
-                <w:sz w:val="20"/>
-              </w:rPr>
               <w:t>Tuần</w:t>
             </w:r>
           </w:p>
@@ -1859,12 +1846,7 @@
             <w:tcW w:type="dxa" w:w="4320"/>
           </w:tcPr>
           <w:p>
-            <w:r/>
             <w:r>
-              <w:rPr>
-                <w:b/>
-                <w:sz w:val="20"/>
-              </w:rPr>
               <w:t>Công việc chính</w:t>
             </w:r>
           </w:p>
@@ -1876,11 +1858,7 @@
             <w:tcW w:type="dxa" w:w="4320"/>
           </w:tcPr>
           <w:p>
-            <w:r/>
             <w:r>
-              <w:rPr>
-                <w:sz w:val="19"/>
-              </w:rPr>
               <w:t>1</w:t>
             </w:r>
           </w:p>
@@ -1890,12 +1868,8 @@
             <w:tcW w:type="dxa" w:w="4320"/>
           </w:tcPr>
           <w:p>
-            <w:r/>
             <w:r>
-              <w:rPr>
-                <w:sz w:val="19"/>
-              </w:rPr>
-              <w:t>Phân tích vòng đời phiếu mượn; thiết kế bảng loans/loan_details; định nghĩa các enum trạng thái.</w:t>
+              <w:t>Phân tích yêu cầu tra cứu; thiết kế bảng books và 4 loại tài liệu (DocType).</w:t>
             </w:r>
           </w:p>
         </w:tc>
@@ -1906,11 +1880,7 @@
             <w:tcW w:type="dxa" w:w="4320"/>
           </w:tcPr>
           <w:p>
-            <w:r/>
             <w:r>
-              <w:rPr>
-                <w:sz w:val="19"/>
-              </w:rPr>
               <w:t>2</w:t>
             </w:r>
           </w:p>
@@ -1920,12 +1890,8 @@
             <w:tcW w:type="dxa" w:w="4320"/>
           </w:tcPr>
           <w:p>
-            <w:r/>
             <w:r>
-              <w:rPr>
-                <w:sz w:val="19"/>
-              </w:rPr>
-              <w:t>Entity Loan/LoanDetail + hàm hỗ trợ (isOverdue, getDaysRemaining…); LoanRepository, LoanDetailRepository.</w:t>
+              <w:t>Entity Book + enum DocType/BookCondition; BookRepository.searchBooks (LIKE theo nhan đề/tác giả/ISBN/mã phân loại).</w:t>
             </w:r>
           </w:p>
         </w:tc>
@@ -1936,11 +1902,7 @@
             <w:tcW w:type="dxa" w:w="4320"/>
           </w:tcPr>
           <w:p>
-            <w:r/>
             <w:r>
-              <w:rPr>
-                <w:sz w:val="19"/>
-              </w:rPr>
               <w:t>3</w:t>
             </w:r>
           </w:p>
@@ -1950,12 +1912,8 @@
             <w:tcW w:type="dxa" w:w="4320"/>
           </w:tcPr>
           <w:p>
-            <w:r/>
             <w:r>
-              <w:rPr>
-                <w:sz w:val="19"/>
-              </w:rPr>
-              <w:t>LoanService bản đầu (submitLoan, approveLoan, returnBook, renewBook); dashboard thống kê.</w:t>
+              <w:t>BookService (search, CRUD, toForm); khởi tạo trang chủ home.html.</w:t>
             </w:r>
           </w:p>
         </w:tc>
@@ -1966,11 +1924,7 @@
             <w:tcW w:type="dxa" w:w="4320"/>
           </w:tcPr>
           <w:p>
-            <w:r/>
             <w:r>
-              <w:rPr>
-                <w:sz w:val="19"/>
-              </w:rPr>
               <w:t>4</w:t>
             </w:r>
           </w:p>
@@ -1980,12 +1934,8 @@
             <w:tcW w:type="dxa" w:w="4320"/>
           </w:tcPr>
           <w:p>
-            <w:r/>
             <w:r>
-              <w:rPr>
-                <w:sz w:val="19"/>
-              </w:rPr>
-              <w:t>Trang loans-pending/loans-active/my-loans; tính phạt &amp; gia hạn; hoàn thiện luồng mượn–trả.</w:t>
+              <w:t>Hoàn thiện home.html (từ khoá, lọc loại, lọc còn sẵn); trang chi tiết book-detail.html.</w:t>
             </w:r>
           </w:p>
         </w:tc>
@@ -1996,11 +1946,7 @@
             <w:tcW w:type="dxa" w:w="4320"/>
           </w:tcPr>
           <w:p>
-            <w:r/>
             <w:r>
-              <w:rPr>
-                <w:sz w:val="19"/>
-              </w:rPr>
               <w:t>5</w:t>
             </w:r>
           </w:p>
@@ -2010,12 +1956,8 @@
             <w:tcW w:type="dxa" w:w="4320"/>
           </w:tcPr>
           <w:p>
-            <w:r/>
             <w:r>
-              <w:rPr>
-                <w:sz w:val="19"/>
-              </w:rPr>
-              <w:t>Thiết kế lại trạng thái AWAITING_PICKUP/BORROWED + RESERVED; thêm pickup_code/pickup_deadline/picked_up_at vào Loan; submitLoan sinh mã mượn + hạn 24h.</w:t>
+              <w:t>Trang quản lý books.html và form book-form.html (thêm/sửa/xoá, chọn DocType, số lượng bản).</w:t>
             </w:r>
           </w:p>
         </w:tc>
@@ -2026,11 +1968,7 @@
             <w:tcW w:type="dxa" w:w="4320"/>
           </w:tcPr>
           <w:p>
-            <w:r/>
             <w:r>
-              <w:rPr>
-                <w:sz w:val="19"/>
-              </w:rPr>
               <w:t>6</w:t>
             </w:r>
           </w:p>
@@ -2040,12 +1978,8 @@
             <w:tcW w:type="dxa" w:w="4320"/>
           </w:tcPr>
           <w:p>
-            <w:r/>
             <w:r>
-              <w:rPr>
-                <w:sz w:val="19"/>
-              </w:rPr>
-              <w:t>Viết confirmPickup (SV tự nhập mã xác nhận); bỏ bước duyệt; PickupExpiryScheduler + @EnableScheduling (cancelExpiredPickups tự huỷ sau 24h).</w:t>
+              <w:t>Tinh chỉnh giao diện Bootstrap danh mục; chuẩn bị 24 sách mẫu; demo giữa kỳ (v2).</w:t>
             </w:r>
           </w:p>
         </w:tc>
@@ -2056,11 +1990,7 @@
             <w:tcW w:type="dxa" w:w="4320"/>
           </w:tcPr>
           <w:p>
-            <w:r/>
             <w:r>
-              <w:rPr>
-                <w:sz w:val="19"/>
-              </w:rPr>
               <w:t>7</w:t>
             </w:r>
           </w:p>
@@ -2070,12 +2000,8 @@
             <w:tcW w:type="dxa" w:w="4320"/>
           </w:tcPr>
           <w:p>
-            <w:r/>
             <w:r>
-              <w:rPr>
-                <w:sz w:val="19"/>
-              </w:rPr>
-              <w:t>Cập nhật my-loans (mục 'Đơn chờ lấy' + ô nhập mã), loans-pending (bỏ nút duyệt, còn chuẩn bị sách), nhãn trạng thái.</w:t>
+              <w:t>Phối hợp đưa cơ chế ẩn/hiện vào tìm kiếm (lọc theo tập loại tài liệu được phép xem).</w:t>
             </w:r>
           </w:p>
         </w:tc>
@@ -2086,11 +2012,7 @@
             <w:tcW w:type="dxa" w:w="4320"/>
           </w:tcPr>
           <w:p>
-            <w:r/>
             <w:r>
-              <w:rPr>
-                <w:sz w:val="19"/>
-              </w:rPr>
               <w:t>8</w:t>
             </w:r>
           </w:p>
@@ -2100,12 +2022,96 @@
             <w:tcW w:type="dxa" w:w="4320"/>
           </w:tcPr>
           <w:p>
-            <w:r/>
             <w:r>
-              <w:rPr>
-                <w:sz w:val="19"/>
-              </w:rPr>
-              <w:t>Sửa lỗi giữ chỗ trong submitLoan (kiểm tra tồn kho trước khi trừ); kiểm thử end-to-end (mượn→nhập mã→đang mượn, sai mã, tự huỷ); viết phần báo cáo tương ứng.</w:t>
+              <w:t>Cập nhật home/book-detail chỉ hiển thị loại tài liệu được phép với vai trò; cờ 'đã ở trong giỏ'.</w:t>
+            </w:r>
+          </w:p>
+        </w:tc>
+      </w:tr>
+      <w:tr>
+        <w:tc>
+          <w:tcPr>
+            <w:tcW w:type="dxa" w:w="4320"/>
+          </w:tcPr>
+          <w:p>
+            <w:r>
+              <w:t>9</w:t>
+            </w:r>
+          </w:p>
+        </w:tc>
+        <w:tc>
+          <w:tcPr>
+            <w:tcW w:type="dxa" w:w="4320"/>
+          </w:tcPr>
+          <w:p>
+            <w:r>
+              <w:t>Chuyển quản lý sách &amp; tồn kho sang khu Thủ thư (route /librarian/books, navbar).</w:t>
+            </w:r>
+          </w:p>
+        </w:tc>
+      </w:tr>
+      <w:tr>
+        <w:tc>
+          <w:tcPr>
+            <w:tcW w:type="dxa" w:w="4320"/>
+          </w:tcPr>
+          <w:p>
+            <w:r>
+              <w:t>10</w:t>
+            </w:r>
+          </w:p>
+        </w:tc>
+        <w:tc>
+          <w:tcPr>
+            <w:tcW w:type="dxa" w:w="4320"/>
+          </w:tcPr>
+          <w:p>
+            <w:r>
+              <w:t>Phối hợp chặn thêm vào giỏ với loại đang bị ẩn/RESTRICTED; xử lý ảnh bìa/placeholder.</w:t>
+            </w:r>
+          </w:p>
+        </w:tc>
+      </w:tr>
+      <w:tr>
+        <w:tc>
+          <w:tcPr>
+            <w:tcW w:type="dxa" w:w="4320"/>
+          </w:tcPr>
+          <w:p>
+            <w:r>
+              <w:t>11</w:t>
+            </w:r>
+          </w:p>
+        </w:tc>
+        <w:tc>
+          <w:tcPr>
+            <w:tcW w:type="dxa" w:w="4320"/>
+          </w:tcPr>
+          <w:p>
+            <w:r>
+              <w:t>Đồng bộ availableCopies khi mượn/trả/huỷ; rà soát hiển thị tồn kho.</w:t>
+            </w:r>
+          </w:p>
+        </w:tc>
+      </w:tr>
+      <w:tr>
+        <w:tc>
+          <w:tcPr>
+            <w:tcW w:type="dxa" w:w="4320"/>
+          </w:tcPr>
+          <w:p>
+            <w:r>
+              <w:t>12</w:t>
+            </w:r>
+          </w:p>
+        </w:tc>
+        <w:tc>
+          <w:tcPr>
+            <w:tcW w:type="dxa" w:w="4320"/>
+          </w:tcPr>
+          <w:p>
+            <w:r>
+              <w:t>Kiểm thử tìm kiếm/lọc/CRUD; tinh chỉnh giao diện; viết phần báo cáo tương ứng.</w:t>
             </w:r>
           </w:p>
         </w:tc>
@@ -2129,7 +2135,7 @@
           <w:b w:val="0"/>
           <w:i w:val="0"/>
         </w:rPr>
-        <w:t>Sau 8 tuần, nhóm hoàn thành hệ thống đáp ứng đầy đủ nhận xét của giảng viên:</w:t>
+        <w:t>Sau 12 tuần, nhóm hoàn thành hệ thống đáp ứng đầy đủ nhận xét của giảng viên:</w:t>
       </w:r>
     </w:p>
     <w:p>
@@ -2178,7 +2184,7 @@
           <w:b w:val="0"/>
           <w:i/>
         </w:rPr>
-        <w:t>Sản phẩm bàn giao: mã nguồn dự án (thư mục library-management), cơ sở dữ liệu mẫu (data.sql), báo cáo kỹ thuật BaoCao_QuanLyThuVien_v3.docx và báo cáo tiến độ theo tuần này.</w:t>
+        <w:t>Sản phẩm bàn giao: mã nguồn dự án (thư mục library-management), cơ sở dữ liệu mẫu (data.sql), báo cáo kỹ thuật song ngữ BaoCao_QuanLyThuVien_v3.2_en.docx và BaoCao_QuanLyThuVien_v3.2_vi.docx, cùng báo cáo tiến độ theo tuần này.</w:t>
       </w:r>
     </w:p>
     <w:sectPr>

</xml_diff>

<commit_message>
docs: restructure weekly report by week (per-week member tasks)
Each of the 12 weeks now has one table listing what every member did
that week, instead of one table per member spanning 12 weeks.

Co-Authored-By: Claude Opus 4.8 <noreply@anthropic.com>
</commit_message>
<xml_diff>
--- a/BaoCao_TienDo_Tuan.docx
+++ b/BaoCao_TienDo_Tuan.docx
@@ -879,6 +879,9 @@
       </w:r>
     </w:p>
     <w:p>
+      <w:pPr/>
+    </w:p>
+    <w:p>
       <w:pPr>
         <w:pStyle w:val="Heading2"/>
       </w:pPr>
@@ -886,14 +889,13 @@
         <w:rPr>
           <w:color w:val="1F3A5F"/>
         </w:rPr>
-        <w:t>3.1  Nguyễn Thị Thu Hà — Vòng đời phiếu mượn, Lấy sách &amp; Lập lịch</w:t>
+        <w:t>3.1  Tuần 1 — Khởi tạo</w:t>
       </w:r>
     </w:p>
     <w:tbl>
       <w:tblPr>
         <w:tblStyle w:val="LightGrid-Accent1"/>
         <w:tblW w:type="auto" w:w="0"/>
-        <w:jc w:val="center"/>
         <w:tblLook w:firstColumn="1" w:firstRow="1" w:lastColumn="0" w:lastRow="0" w:noHBand="0" w:noVBand="1" w:val="04A0"/>
       </w:tblPr>
       <w:tblGrid>
@@ -903,21 +905,21 @@
       <w:tr>
         <w:tc>
           <w:tcPr>
-            <w:tcW w:type="dxa" w:w="4320"/>
+            <w:tcW w:type="dxa" w:w="2740"/>
           </w:tcPr>
           <w:p>
             <w:r>
-              <w:t>Tuần</w:t>
+              <w:t>Thành viên</w:t>
             </w:r>
           </w:p>
         </w:tc>
         <w:tc>
           <w:tcPr>
-            <w:tcW w:type="dxa" w:w="4320"/>
+            <w:tcW w:type="dxa" w:w="5900"/>
           </w:tcPr>
           <w:p>
             <w:r>
-              <w:t>Công việc chính</w:t>
+              <w:t>Công việc trong tuần</w:t>
             </w:r>
           </w:p>
         </w:tc>
@@ -925,21 +927,23 @@
       <w:tr>
         <w:tc>
           <w:tcPr>
-            <w:tcW w:type="dxa" w:w="4320"/>
+            <w:tcW w:type="dxa" w:w="2740"/>
           </w:tcPr>
           <w:p>
             <w:r>
-              <w:t>1</w:t>
+              <w:t>Phạm Minh Tuyên</w:t>
+              <w:br/>
+              <w:t>(Xác thực, Người dùng &amp; Phân quyền)</w:t>
             </w:r>
           </w:p>
         </w:tc>
         <w:tc>
           <w:tcPr>
-            <w:tcW w:type="dxa" w:w="4320"/>
+            <w:tcW w:type="dxa" w:w="5900"/>
           </w:tcPr>
           <w:p>
             <w:r>
-              <w:t>Phân tích vòng đời phiếu mượn; thiết kế bảng loans/loan_details và các enum trạng thái.</w:t>
+              <w:t>Tham gia phân tích yêu cầu; thiết kế bảng users &amp; sơ đồ vai trò; chọn cơ chế bảo mật (form login + BCrypt).</w:t>
             </w:r>
           </w:p>
         </w:tc>
@@ -947,21 +951,23 @@
       <w:tr>
         <w:tc>
           <w:tcPr>
-            <w:tcW w:type="dxa" w:w="4320"/>
+            <w:tcW w:type="dxa" w:w="2740"/>
           </w:tcPr>
           <w:p>
             <w:r>
-              <w:t>2</w:t>
+              <w:t>Lê Hà Hải Vân</w:t>
+              <w:br/>
+              <w:t>(Danh mục &amp; Tìm kiếm sách)</w:t>
             </w:r>
           </w:p>
         </w:tc>
         <w:tc>
           <w:tcPr>
-            <w:tcW w:type="dxa" w:w="4320"/>
+            <w:tcW w:type="dxa" w:w="5900"/>
           </w:tcPr>
           <w:p>
             <w:r>
-              <w:t>Entity Loan/LoanDetail + hàm hỗ trợ (isOverdue, getDaysRemaining…); LoanRepository, LoanDetailRepository.</w:t>
+              <w:t>Phân tích yêu cầu tra cứu; thiết kế bảng books và 4 loại tài liệu (DocType).</w:t>
             </w:r>
           </w:p>
         </w:tc>
@@ -969,283 +975,19 @@
       <w:tr>
         <w:tc>
           <w:tcPr>
-            <w:tcW w:type="dxa" w:w="4320"/>
+            <w:tcW w:type="dxa" w:w="2740"/>
           </w:tcPr>
           <w:p>
             <w:r>
-              <w:t>3</w:t>
+              <w:t>Bùi Thanh Thảo</w:t>
+              <w:br/>
+              <w:t>(Quy tắc mượn, Ẩn/hiện &amp; Giỏ sách)</w:t>
             </w:r>
           </w:p>
         </w:tc>
         <w:tc>
           <w:tcPr>
-            <w:tcW w:type="dxa" w:w="4320"/>
-          </w:tcPr>
-          <w:p>
-            <w:r>
-              <w:t>LoanService bản đầu (submitLoan, approveLoan, returnBook, renewBook) theo mô hình có duyệt.</w:t>
-            </w:r>
-          </w:p>
-        </w:tc>
-      </w:tr>
-      <w:tr>
-        <w:tc>
-          <w:tcPr>
-            <w:tcW w:type="dxa" w:w="4320"/>
-          </w:tcPr>
-          <w:p>
-            <w:r>
-              <w:t>4</w:t>
-            </w:r>
-          </w:p>
-        </w:tc>
-        <w:tc>
-          <w:tcPr>
-            <w:tcW w:type="dxa" w:w="4320"/>
-          </w:tcPr>
-          <w:p>
-            <w:r>
-              <w:t>Dashboard thống kê; trang loans-pending/loans-active.</w:t>
-            </w:r>
-          </w:p>
-        </w:tc>
-      </w:tr>
-      <w:tr>
-        <w:tc>
-          <w:tcPr>
-            <w:tcW w:type="dxa" w:w="4320"/>
-          </w:tcPr>
-          <w:p>
-            <w:r>
-              <w:t>5</w:t>
-            </w:r>
-          </w:p>
-        </w:tc>
-        <w:tc>
-          <w:tcPr>
-            <w:tcW w:type="dxa" w:w="4320"/>
-          </w:tcPr>
-          <w:p>
-            <w:r>
-              <w:t>Trang my-loans; tính phí trễ &amp; gia hạn; hoàn thiện luồng mượn–trả bản 1.</w:t>
-            </w:r>
-          </w:p>
-        </w:tc>
-      </w:tr>
-      <w:tr>
-        <w:tc>
-          <w:tcPr>
-            <w:tcW w:type="dxa" w:w="4320"/>
-          </w:tcPr>
-          <w:p>
-            <w:r>
-              <w:t>6</w:t>
-            </w:r>
-          </w:p>
-        </w:tc>
-        <w:tc>
-          <w:tcPr>
-            <w:tcW w:type="dxa" w:w="4320"/>
-          </w:tcPr>
-          <w:p>
-            <w:r>
-              <w:t>Tinh chỉnh giao diện phiếu mượn; chuẩn bị demo giữa kỳ (v2).</w:t>
-            </w:r>
-          </w:p>
-        </w:tc>
-      </w:tr>
-      <w:tr>
-        <w:tc>
-          <w:tcPr>
-            <w:tcW w:type="dxa" w:w="4320"/>
-          </w:tcPr>
-          <w:p>
-            <w:r>
-              <w:t>7</w:t>
-            </w:r>
-          </w:p>
-        </w:tc>
-        <w:tc>
-          <w:tcPr>
-            <w:tcW w:type="dxa" w:w="4320"/>
-          </w:tcPr>
-          <w:p>
-            <w:r>
-              <w:t>Thiết kế lại trạng thái AWAITING_PICKUP/BORROWED/COMPLETED/CANCELLED + RESERVED; thêm pickup_code/pickup_deadline/picked_up_at; submitLoan sinh mã 6 ký tự + hạn 24h.</w:t>
-            </w:r>
-          </w:p>
-        </w:tc>
-      </w:tr>
-      <w:tr>
-        <w:tc>
-          <w:tcPr>
-            <w:tcW w:type="dxa" w:w="4320"/>
-          </w:tcPr>
-          <w:p>
-            <w:r>
-              <w:t>8</w:t>
-            </w:r>
-          </w:p>
-        </w:tc>
-        <w:tc>
-          <w:tcPr>
-            <w:tcW w:type="dxa" w:w="4320"/>
-          </w:tcPr>
-          <w:p>
-            <w:r>
-              <w:t>confirmPickup (bạn đọc tự nhập mã → BORROWED), bỏ bước duyệt; PickupExpiryScheduler + @EnableScheduling (cancelExpiredPickups tự huỷ sau 24h).</w:t>
-            </w:r>
-          </w:p>
-        </w:tc>
-      </w:tr>
-      <w:tr>
-        <w:tc>
-          <w:tcPr>
-            <w:tcW w:type="dxa" w:w="4320"/>
-          </w:tcPr>
-          <w:p>
-            <w:r>
-              <w:t>9</w:t>
-            </w:r>
-          </w:p>
-        </w:tc>
-        <w:tc>
-          <w:tcPr>
-            <w:tcW w:type="dxa" w:w="4320"/>
-          </w:tcPr>
-          <w:p>
-            <w:r>
-              <w:t>cancelLoan/cancelByReader (huỷ kèm lý do, hoàn số lượng); cập nhật my-loans ('Đơn chờ lấy' + ô nhập mã) và loans.html (bỏ nút duyệt, chỉ chuẩn bị sách).</w:t>
-            </w:r>
-          </w:p>
-        </w:tc>
-      </w:tr>
-      <w:tr>
-        <w:tc>
-          <w:tcPr>
-            <w:tcW w:type="dxa" w:w="4320"/>
-          </w:tcPr>
-          <w:p>
-            <w:r>
-              <w:t>10</w:t>
-            </w:r>
-          </w:p>
-        </w:tc>
-        <w:tc>
-          <w:tcPr>
-            <w:tcW w:type="dxa" w:w="4320"/>
-          </w:tcPr>
-          <w:p>
-            <w:r>
-              <w:t>NotificationService (notify/notifyRole) + Notification.java + notifications.html (chuông navbar); lendInHouse + inhouse.html (đọc tại chỗ) trong LibrarianController.</w:t>
-            </w:r>
-          </w:p>
-        </w:tc>
-      </w:tr>
-      <w:tr>
-        <w:tc>
-          <w:tcPr>
-            <w:tcW w:type="dxa" w:w="4320"/>
-          </w:tcPr>
-          <w:p>
-            <w:r>
-              <w:t>11</w:t>
-            </w:r>
-          </w:p>
-        </w:tc>
-        <w:tc>
-          <w:tcPr>
-            <w:tcW w:type="dxa" w:w="4320"/>
-          </w:tcPr>
-          <w:p>
-            <w:r>
-              <w:t>Sửa lỗi giữ chỗ trong submitLoan (kiểm tra tồn kho trước khi trừ); payFine + finePaid → refreshCompletion (COMPLETED); sendDueReminders.</w:t>
-            </w:r>
-          </w:p>
-        </w:tc>
-      </w:tr>
-      <w:tr>
-        <w:tc>
-          <w:tcPr>
-            <w:tcW w:type="dxa" w:w="4320"/>
-          </w:tcPr>
-          <w:p>
-            <w:r>
-              <w:t>12</w:t>
-            </w:r>
-          </w:p>
-        </w:tc>
-        <w:tc>
-          <w:tcPr>
-            <w:tcW w:type="dxa" w:w="4320"/>
-          </w:tcPr>
-          <w:p>
-            <w:r>
-              <w:t>Kiểm thử end-to-end (mượn→nhập mã→đang mượn, sai mã, tự huỷ, thu phí, đọc tại chỗ); viết phần báo cáo tương ứng.</w:t>
-            </w:r>
-          </w:p>
-        </w:tc>
-      </w:tr>
-    </w:tbl>
-    <w:p/>
-    <w:p>
-      <w:pPr>
-        <w:pStyle w:val="Heading2"/>
-      </w:pPr>
-      <w:r>
-        <w:rPr>
-          <w:color w:val="1F3A5F"/>
-        </w:rPr>
-        <w:t>3.2  Bùi Thanh Thảo — Quy tắc mượn, Ẩn/hiện &amp; Giỏ sách</w:t>
-      </w:r>
-    </w:p>
-    <w:tbl>
-      <w:tblPr>
-        <w:tblStyle w:val="LightGrid-Accent1"/>
-        <w:tblW w:type="auto" w:w="0"/>
-        <w:jc w:val="center"/>
-        <w:tblLook w:firstColumn="1" w:firstRow="1" w:lastColumn="0" w:lastRow="0" w:noHBand="0" w:noVBand="1" w:val="04A0"/>
-      </w:tblPr>
-      <w:tblGrid>
-        <w:gridCol w:w="4320"/>
-        <w:gridCol w:w="4320"/>
-      </w:tblGrid>
-      <w:tr>
-        <w:tc>
-          <w:tcPr>
-            <w:tcW w:type="dxa" w:w="4320"/>
-          </w:tcPr>
-          <w:p>
-            <w:r>
-              <w:t>Tuần</w:t>
-            </w:r>
-          </w:p>
-        </w:tc>
-        <w:tc>
-          <w:tcPr>
-            <w:tcW w:type="dxa" w:w="4320"/>
-          </w:tcPr>
-          <w:p>
-            <w:r>
-              <w:t>Công việc chính</w:t>
-            </w:r>
-          </w:p>
-        </w:tc>
-      </w:tr>
-      <w:tr>
-        <w:tc>
-          <w:tcPr>
-            <w:tcW w:type="dxa" w:w="4320"/>
-          </w:tcPr>
-          <w:p>
-            <w:r>
-              <w:t>1</w:t>
-            </w:r>
-          </w:p>
-        </w:tc>
-        <w:tc>
-          <w:tcPr>
-            <w:tcW w:type="dxa" w:w="4320"/>
+            <w:tcW w:type="dxa" w:w="5900"/>
           </w:tcPr>
           <w:p>
             <w:r>
@@ -1257,17 +999,138 @@
       <w:tr>
         <w:tc>
           <w:tcPr>
-            <w:tcW w:type="dxa" w:w="4320"/>
+            <w:tcW w:type="dxa" w:w="2740"/>
           </w:tcPr>
           <w:p>
             <w:r>
-              <w:t>2</w:t>
+              <w:t>Nguyễn Thị Thu Hà</w:t>
+              <w:br/>
+              <w:t>(Vòng đời phiếu mượn, Lấy sách &amp; Lập lịch)</w:t>
             </w:r>
           </w:p>
         </w:tc>
         <w:tc>
           <w:tcPr>
-            <w:tcW w:type="dxa" w:w="4320"/>
+            <w:tcW w:type="dxa" w:w="5900"/>
+          </w:tcPr>
+          <w:p>
+            <w:r>
+              <w:t>Phân tích vòng đời phiếu mượn; thiết kế bảng loans/loan_details và các enum trạng thái.</w:t>
+            </w:r>
+          </w:p>
+        </w:tc>
+      </w:tr>
+    </w:tbl>
+    <w:p>
+      <w:pPr/>
+    </w:p>
+    <w:p>
+      <w:pPr>
+        <w:pStyle w:val="Heading2"/>
+      </w:pPr>
+      <w:r>
+        <w:rPr>
+          <w:color w:val="1F3A5F"/>
+        </w:rPr>
+        <w:t>3.2  Tuần 2 — Thiết kế</w:t>
+      </w:r>
+    </w:p>
+    <w:tbl>
+      <w:tblPr>
+        <w:tblStyle w:val="LightGrid-Accent1"/>
+        <w:tblW w:type="auto" w:w="0"/>
+        <w:tblLook w:firstColumn="1" w:firstRow="1" w:lastColumn="0" w:lastRow="0" w:noHBand="0" w:noVBand="1" w:val="04A0"/>
+      </w:tblPr>
+      <w:tblGrid>
+        <w:gridCol w:w="4320"/>
+        <w:gridCol w:w="4320"/>
+      </w:tblGrid>
+      <w:tr>
+        <w:tc>
+          <w:tcPr>
+            <w:tcW w:type="dxa" w:w="2740"/>
+          </w:tcPr>
+          <w:p>
+            <w:r>
+              <w:t>Thành viên</w:t>
+            </w:r>
+          </w:p>
+        </w:tc>
+        <w:tc>
+          <w:tcPr>
+            <w:tcW w:type="dxa" w:w="5900"/>
+          </w:tcPr>
+          <w:p>
+            <w:r>
+              <w:t>Công việc trong tuần</w:t>
+            </w:r>
+          </w:p>
+        </w:tc>
+      </w:tr>
+      <w:tr>
+        <w:tc>
+          <w:tcPr>
+            <w:tcW w:type="dxa" w:w="2740"/>
+          </w:tcPr>
+          <w:p>
+            <w:r>
+              <w:t>Phạm Minh Tuyên</w:t>
+              <w:br/>
+              <w:t>(Xác thực, Người dùng &amp; Phân quyền)</w:t>
+            </w:r>
+          </w:p>
+        </w:tc>
+        <w:tc>
+          <w:tcPr>
+            <w:tcW w:type="dxa" w:w="5900"/>
+          </w:tcPr>
+          <w:p>
+            <w:r>
+              <w:t>Entity User, enum UserRole/CardStatus; UserRepository.findByStudentCode.</w:t>
+            </w:r>
+          </w:p>
+        </w:tc>
+      </w:tr>
+      <w:tr>
+        <w:tc>
+          <w:tcPr>
+            <w:tcW w:type="dxa" w:w="2740"/>
+          </w:tcPr>
+          <w:p>
+            <w:r>
+              <w:t>Lê Hà Hải Vân</w:t>
+              <w:br/>
+              <w:t>(Danh mục &amp; Tìm kiếm sách)</w:t>
+            </w:r>
+          </w:p>
+        </w:tc>
+        <w:tc>
+          <w:tcPr>
+            <w:tcW w:type="dxa" w:w="5900"/>
+          </w:tcPr>
+          <w:p>
+            <w:r>
+              <w:t>Entity Book + enum DocType/BookCondition; BookRepository.searchBooks (LIKE theo nhan đề/tác giả/ISBN/mã phân loại).</w:t>
+            </w:r>
+          </w:p>
+        </w:tc>
+      </w:tr>
+      <w:tr>
+        <w:tc>
+          <w:tcPr>
+            <w:tcW w:type="dxa" w:w="2740"/>
+          </w:tcPr>
+          <w:p>
+            <w:r>
+              <w:t>Bùi Thanh Thảo</w:t>
+              <w:br/>
+              <w:t>(Quy tắc mượn, Ẩn/hiện &amp; Giỏ sách)</w:t>
+            </w:r>
+          </w:p>
+        </w:tc>
+        <w:tc>
+          <w:tcPr>
+            <w:tcW w:type="dxa" w:w="5900"/>
           </w:tcPr>
           <w:p>
             <w:r>
@@ -1279,17 +1142,138 @@
       <w:tr>
         <w:tc>
           <w:tcPr>
-            <w:tcW w:type="dxa" w:w="4320"/>
+            <w:tcW w:type="dxa" w:w="2740"/>
           </w:tcPr>
           <w:p>
             <w:r>
-              <w:t>3</w:t>
+              <w:t>Nguyễn Thị Thu Hà</w:t>
+              <w:br/>
+              <w:t>(Vòng đời phiếu mượn, Lấy sách &amp; Lập lịch)</w:t>
             </w:r>
           </w:p>
         </w:tc>
         <w:tc>
           <w:tcPr>
-            <w:tcW w:type="dxa" w:w="4320"/>
+            <w:tcW w:type="dxa" w:w="5900"/>
+          </w:tcPr>
+          <w:p>
+            <w:r>
+              <w:t>Entity Loan/LoanDetail + hàm hỗ trợ (isOverdue, getDaysRemaining…); LoanRepository, LoanDetailRepository.</w:t>
+            </w:r>
+          </w:p>
+        </w:tc>
+      </w:tr>
+    </w:tbl>
+    <w:p>
+      <w:pPr/>
+    </w:p>
+    <w:p>
+      <w:pPr>
+        <w:pStyle w:val="Heading2"/>
+      </w:pPr>
+      <w:r>
+        <w:rPr>
+          <w:color w:val="1F3A5F"/>
+        </w:rPr>
+        <w:t>3.3  Tuần 3 — Nền tảng</w:t>
+      </w:r>
+    </w:p>
+    <w:tbl>
+      <w:tblPr>
+        <w:tblStyle w:val="LightGrid-Accent1"/>
+        <w:tblW w:type="auto" w:w="0"/>
+        <w:tblLook w:firstColumn="1" w:firstRow="1" w:lastColumn="0" w:lastRow="0" w:noHBand="0" w:noVBand="1" w:val="04A0"/>
+      </w:tblPr>
+      <w:tblGrid>
+        <w:gridCol w:w="4320"/>
+        <w:gridCol w:w="4320"/>
+      </w:tblGrid>
+      <w:tr>
+        <w:tc>
+          <w:tcPr>
+            <w:tcW w:type="dxa" w:w="2740"/>
+          </w:tcPr>
+          <w:p>
+            <w:r>
+              <w:t>Thành viên</w:t>
+            </w:r>
+          </w:p>
+        </w:tc>
+        <w:tc>
+          <w:tcPr>
+            <w:tcW w:type="dxa" w:w="5900"/>
+          </w:tcPr>
+          <w:p>
+            <w:r>
+              <w:t>Công việc trong tuần</w:t>
+            </w:r>
+          </w:p>
+        </w:tc>
+      </w:tr>
+      <w:tr>
+        <w:tc>
+          <w:tcPr>
+            <w:tcW w:type="dxa" w:w="2740"/>
+          </w:tcPr>
+          <w:p>
+            <w:r>
+              <w:t>Phạm Minh Tuyên</w:t>
+              <w:br/>
+              <w:t>(Xác thực, Người dùng &amp; Phân quyền)</w:t>
+            </w:r>
+          </w:p>
+        </w:tc>
+        <w:tc>
+          <w:tcPr>
+            <w:tcW w:type="dxa" w:w="5900"/>
+          </w:tcPr>
+          <w:p>
+            <w:r>
+              <w:t>Cấu hình SecurityConfig + CustomUserDetailsService; trang login.html; AuthController điều hướng theo vai trò.</w:t>
+            </w:r>
+          </w:p>
+        </w:tc>
+      </w:tr>
+      <w:tr>
+        <w:tc>
+          <w:tcPr>
+            <w:tcW w:type="dxa" w:w="2740"/>
+          </w:tcPr>
+          <w:p>
+            <w:r>
+              <w:t>Lê Hà Hải Vân</w:t>
+              <w:br/>
+              <w:t>(Danh mục &amp; Tìm kiếm sách)</w:t>
+            </w:r>
+          </w:p>
+        </w:tc>
+        <w:tc>
+          <w:tcPr>
+            <w:tcW w:type="dxa" w:w="5900"/>
+          </w:tcPr>
+          <w:p>
+            <w:r>
+              <w:t>BookService (search, CRUD, toForm); khởi tạo trang chủ home.html.</w:t>
+            </w:r>
+          </w:p>
+        </w:tc>
+      </w:tr>
+      <w:tr>
+        <w:tc>
+          <w:tcPr>
+            <w:tcW w:type="dxa" w:w="2740"/>
+          </w:tcPr>
+          <w:p>
+            <w:r>
+              <w:t>Bùi Thanh Thảo</w:t>
+              <w:br/>
+              <w:t>(Quy tắc mượn, Ẩn/hiện &amp; Giỏ sách)</w:t>
+            </w:r>
+          </w:p>
+        </w:tc>
+        <w:tc>
+          <w:tcPr>
+            <w:tcW w:type="dxa" w:w="5900"/>
           </w:tcPr>
           <w:p>
             <w:r>
@@ -1301,17 +1285,138 @@
       <w:tr>
         <w:tc>
           <w:tcPr>
-            <w:tcW w:type="dxa" w:w="4320"/>
+            <w:tcW w:type="dxa" w:w="2740"/>
           </w:tcPr>
           <w:p>
             <w:r>
-              <w:t>4</w:t>
+              <w:t>Nguyễn Thị Thu Hà</w:t>
+              <w:br/>
+              <w:t>(Vòng đời phiếu mượn, Lấy sách &amp; Lập lịch)</w:t>
             </w:r>
           </w:p>
         </w:tc>
         <w:tc>
           <w:tcPr>
-            <w:tcW w:type="dxa" w:w="4320"/>
+            <w:tcW w:type="dxa" w:w="5900"/>
+          </w:tcPr>
+          <w:p>
+            <w:r>
+              <w:t>LoanService bản đầu (submitLoan, approveLoan, returnBook, renewBook) theo mô hình có duyệt.</w:t>
+            </w:r>
+          </w:p>
+        </w:tc>
+      </w:tr>
+    </w:tbl>
+    <w:p>
+      <w:pPr/>
+    </w:p>
+    <w:p>
+      <w:pPr>
+        <w:pStyle w:val="Heading2"/>
+      </w:pPr>
+      <w:r>
+        <w:rPr>
+          <w:color w:val="1F3A5F"/>
+        </w:rPr>
+        <w:t>3.4  Tuần 4 — Cốt lõi (I)</w:t>
+      </w:r>
+    </w:p>
+    <w:tbl>
+      <w:tblPr>
+        <w:tblStyle w:val="LightGrid-Accent1"/>
+        <w:tblW w:type="auto" w:w="0"/>
+        <w:tblLook w:firstColumn="1" w:firstRow="1" w:lastColumn="0" w:lastRow="0" w:noHBand="0" w:noVBand="1" w:val="04A0"/>
+      </w:tblPr>
+      <w:tblGrid>
+        <w:gridCol w:w="4320"/>
+        <w:gridCol w:w="4320"/>
+      </w:tblGrid>
+      <w:tr>
+        <w:tc>
+          <w:tcPr>
+            <w:tcW w:type="dxa" w:w="2740"/>
+          </w:tcPr>
+          <w:p>
+            <w:r>
+              <w:t>Thành viên</w:t>
+            </w:r>
+          </w:p>
+        </w:tc>
+        <w:tc>
+          <w:tcPr>
+            <w:tcW w:type="dxa" w:w="5900"/>
+          </w:tcPr>
+          <w:p>
+            <w:r>
+              <w:t>Công việc trong tuần</w:t>
+            </w:r>
+          </w:p>
+        </w:tc>
+      </w:tr>
+      <w:tr>
+        <w:tc>
+          <w:tcPr>
+            <w:tcW w:type="dxa" w:w="2740"/>
+          </w:tcPr>
+          <w:p>
+            <w:r>
+              <w:t>Phạm Minh Tuyên</w:t>
+              <w:br/>
+              <w:t>(Xác thực, Người dùng &amp; Phân quyền)</w:t>
+            </w:r>
+          </w:p>
+        </w:tc>
+        <w:tc>
+          <w:tcPr>
+            <w:tcW w:type="dxa" w:w="5900"/>
+          </w:tcPr>
+          <w:p>
+            <w:r>
+              <w:t>UserService.findAll/search/toggleCardStatus; trang quản lý người dùng users.html (khoá/mở thẻ); trang lỗi 403/404.</w:t>
+            </w:r>
+          </w:p>
+        </w:tc>
+      </w:tr>
+      <w:tr>
+        <w:tc>
+          <w:tcPr>
+            <w:tcW w:type="dxa" w:w="2740"/>
+          </w:tcPr>
+          <w:p>
+            <w:r>
+              <w:t>Lê Hà Hải Vân</w:t>
+              <w:br/>
+              <w:t>(Danh mục &amp; Tìm kiếm sách)</w:t>
+            </w:r>
+          </w:p>
+        </w:tc>
+        <w:tc>
+          <w:tcPr>
+            <w:tcW w:type="dxa" w:w="5900"/>
+          </w:tcPr>
+          <w:p>
+            <w:r>
+              <w:t>Hoàn thiện home.html (từ khoá, lọc loại, lọc còn sẵn); trang chi tiết book-detail.html.</w:t>
+            </w:r>
+          </w:p>
+        </w:tc>
+      </w:tr>
+      <w:tr>
+        <w:tc>
+          <w:tcPr>
+            <w:tcW w:type="dxa" w:w="2740"/>
+          </w:tcPr>
+          <w:p>
+            <w:r>
+              <w:t>Bùi Thanh Thảo</w:t>
+              <w:br/>
+              <w:t>(Quy tắc mượn, Ẩn/hiện &amp; Giỏ sách)</w:t>
+            </w:r>
+          </w:p>
+        </w:tc>
+        <w:tc>
+          <w:tcPr>
+            <w:tcW w:type="dxa" w:w="5900"/>
           </w:tcPr>
           <w:p>
             <w:r>
@@ -1323,17 +1428,138 @@
       <w:tr>
         <w:tc>
           <w:tcPr>
-            <w:tcW w:type="dxa" w:w="4320"/>
+            <w:tcW w:type="dxa" w:w="2740"/>
           </w:tcPr>
           <w:p>
             <w:r>
-              <w:t>5</w:t>
+              <w:t>Nguyễn Thị Thu Hà</w:t>
+              <w:br/>
+              <w:t>(Vòng đời phiếu mượn, Lấy sách &amp; Lập lịch)</w:t>
             </w:r>
           </w:p>
         </w:tc>
         <w:tc>
           <w:tcPr>
-            <w:tcW w:type="dxa" w:w="4320"/>
+            <w:tcW w:type="dxa" w:w="5900"/>
+          </w:tcPr>
+          <w:p>
+            <w:r>
+              <w:t>Dashboard thống kê; trang loans-pending/loans-active.</w:t>
+            </w:r>
+          </w:p>
+        </w:tc>
+      </w:tr>
+    </w:tbl>
+    <w:p>
+      <w:pPr/>
+    </w:p>
+    <w:p>
+      <w:pPr>
+        <w:pStyle w:val="Heading2"/>
+      </w:pPr>
+      <w:r>
+        <w:rPr>
+          <w:color w:val="1F3A5F"/>
+        </w:rPr>
+        <w:t>3.5  Tuần 5 — Cốt lõi (II)</w:t>
+      </w:r>
+    </w:p>
+    <w:tbl>
+      <w:tblPr>
+        <w:tblStyle w:val="LightGrid-Accent1"/>
+        <w:tblW w:type="auto" w:w="0"/>
+        <w:tblLook w:firstColumn="1" w:firstRow="1" w:lastColumn="0" w:lastRow="0" w:noHBand="0" w:noVBand="1" w:val="04A0"/>
+      </w:tblPr>
+      <w:tblGrid>
+        <w:gridCol w:w="4320"/>
+        <w:gridCol w:w="4320"/>
+      </w:tblGrid>
+      <w:tr>
+        <w:tc>
+          <w:tcPr>
+            <w:tcW w:type="dxa" w:w="2740"/>
+          </w:tcPr>
+          <w:p>
+            <w:r>
+              <w:t>Thành viên</w:t>
+            </w:r>
+          </w:p>
+        </w:tc>
+        <w:tc>
+          <w:tcPr>
+            <w:tcW w:type="dxa" w:w="5900"/>
+          </w:tcPr>
+          <w:p>
+            <w:r>
+              <w:t>Công việc trong tuần</w:t>
+            </w:r>
+          </w:p>
+        </w:tc>
+      </w:tr>
+      <w:tr>
+        <w:tc>
+          <w:tcPr>
+            <w:tcW w:type="dxa" w:w="2740"/>
+          </w:tcPr>
+          <w:p>
+            <w:r>
+              <w:t>Phạm Minh Tuyên</w:t>
+              <w:br/>
+              <w:t>(Xác thực, Người dùng &amp; Phân quyền)</w:t>
+            </w:r>
+          </w:p>
+        </w:tc>
+        <w:tc>
+          <w:tcPr>
+            <w:tcW w:type="dxa" w:w="5900"/>
+          </w:tcPr>
+          <w:p>
+            <w:r>
+              <w:t>Gắn xác thực vào các luồng nghiệp vụ; resetPassword; kiểm thử đăng nhập theo vai trò.</w:t>
+            </w:r>
+          </w:p>
+        </w:tc>
+      </w:tr>
+      <w:tr>
+        <w:tc>
+          <w:tcPr>
+            <w:tcW w:type="dxa" w:w="2740"/>
+          </w:tcPr>
+          <w:p>
+            <w:r>
+              <w:t>Lê Hà Hải Vân</w:t>
+              <w:br/>
+              <w:t>(Danh mục &amp; Tìm kiếm sách)</w:t>
+            </w:r>
+          </w:p>
+        </w:tc>
+        <w:tc>
+          <w:tcPr>
+            <w:tcW w:type="dxa" w:w="5900"/>
+          </w:tcPr>
+          <w:p>
+            <w:r>
+              <w:t>Trang quản lý books.html và form book-form.html (thêm/sửa/xoá, chọn DocType, số lượng bản).</w:t>
+            </w:r>
+          </w:p>
+        </w:tc>
+      </w:tr>
+      <w:tr>
+        <w:tc>
+          <w:tcPr>
+            <w:tcW w:type="dxa" w:w="2740"/>
+          </w:tcPr>
+          <w:p>
+            <w:r>
+              <w:t>Bùi Thanh Thảo</w:t>
+              <w:br/>
+              <w:t>(Quy tắc mượn, Ẩn/hiện &amp; Giỏ sách)</w:t>
+            </w:r>
+          </w:p>
+        </w:tc>
+        <w:tc>
+          <w:tcPr>
+            <w:tcW w:type="dxa" w:w="5900"/>
           </w:tcPr>
           <w:p>
             <w:r>
@@ -1345,17 +1571,138 @@
       <w:tr>
         <w:tc>
           <w:tcPr>
-            <w:tcW w:type="dxa" w:w="4320"/>
+            <w:tcW w:type="dxa" w:w="2740"/>
           </w:tcPr>
           <w:p>
             <w:r>
-              <w:t>6</w:t>
+              <w:t>Nguyễn Thị Thu Hà</w:t>
+              <w:br/>
+              <w:t>(Vòng đời phiếu mượn, Lấy sách &amp; Lập lịch)</w:t>
             </w:r>
           </w:p>
         </w:tc>
         <w:tc>
           <w:tcPr>
-            <w:tcW w:type="dxa" w:w="4320"/>
+            <w:tcW w:type="dxa" w:w="5900"/>
+          </w:tcPr>
+          <w:p>
+            <w:r>
+              <w:t>Trang my-loans; tính phí trễ &amp; gia hạn; hoàn thiện luồng mượn–trả bản 1.</w:t>
+            </w:r>
+          </w:p>
+        </w:tc>
+      </w:tr>
+    </w:tbl>
+    <w:p>
+      <w:pPr/>
+    </w:p>
+    <w:p>
+      <w:pPr>
+        <w:pStyle w:val="Heading2"/>
+      </w:pPr>
+      <w:r>
+        <w:rPr>
+          <w:color w:val="1F3A5F"/>
+        </w:rPr>
+        <w:t>3.6  Tuần 6 — Hoàn thiện bản 1 — demo v2</w:t>
+      </w:r>
+    </w:p>
+    <w:tbl>
+      <w:tblPr>
+        <w:tblStyle w:val="LightGrid-Accent1"/>
+        <w:tblW w:type="auto" w:w="0"/>
+        <w:tblLook w:firstColumn="1" w:firstRow="1" w:lastColumn="0" w:lastRow="0" w:noHBand="0" w:noVBand="1" w:val="04A0"/>
+      </w:tblPr>
+      <w:tblGrid>
+        <w:gridCol w:w="4320"/>
+        <w:gridCol w:w="4320"/>
+      </w:tblGrid>
+      <w:tr>
+        <w:tc>
+          <w:tcPr>
+            <w:tcW w:type="dxa" w:w="2740"/>
+          </w:tcPr>
+          <w:p>
+            <w:r>
+              <w:t>Thành viên</w:t>
+            </w:r>
+          </w:p>
+        </w:tc>
+        <w:tc>
+          <w:tcPr>
+            <w:tcW w:type="dxa" w:w="5900"/>
+          </w:tcPr>
+          <w:p>
+            <w:r>
+              <w:t>Công việc trong tuần</w:t>
+            </w:r>
+          </w:p>
+        </w:tc>
+      </w:tr>
+      <w:tr>
+        <w:tc>
+          <w:tcPr>
+            <w:tcW w:type="dxa" w:w="2740"/>
+          </w:tcPr>
+          <w:p>
+            <w:r>
+              <w:t>Phạm Minh Tuyên</w:t>
+              <w:br/>
+              <w:t>(Xác thực, Người dùng &amp; Phân quyền)</w:t>
+            </w:r>
+          </w:p>
+        </w:tc>
+        <w:tc>
+          <w:tcPr>
+            <w:tcW w:type="dxa" w:w="5900"/>
+          </w:tcPr>
+          <w:p>
+            <w:r>
+              <w:t>Rà soát bảo mật cho bản demo v2; chuẩn bị dữ liệu tài khoản mẫu.</w:t>
+            </w:r>
+          </w:p>
+        </w:tc>
+      </w:tr>
+      <w:tr>
+        <w:tc>
+          <w:tcPr>
+            <w:tcW w:type="dxa" w:w="2740"/>
+          </w:tcPr>
+          <w:p>
+            <w:r>
+              <w:t>Lê Hà Hải Vân</w:t>
+              <w:br/>
+              <w:t>(Danh mục &amp; Tìm kiếm sách)</w:t>
+            </w:r>
+          </w:p>
+        </w:tc>
+        <w:tc>
+          <w:tcPr>
+            <w:tcW w:type="dxa" w:w="5900"/>
+          </w:tcPr>
+          <w:p>
+            <w:r>
+              <w:t>Tinh chỉnh giao diện Bootstrap danh mục; chuẩn bị 24 sách mẫu; demo giữa kỳ (v2).</w:t>
+            </w:r>
+          </w:p>
+        </w:tc>
+      </w:tr>
+      <w:tr>
+        <w:tc>
+          <w:tcPr>
+            <w:tcW w:type="dxa" w:w="2740"/>
+          </w:tcPr>
+          <w:p>
+            <w:r>
+              <w:t>Bùi Thanh Thảo</w:t>
+              <w:br/>
+              <w:t>(Quy tắc mượn, Ẩn/hiện &amp; Giỏ sách)</w:t>
+            </w:r>
+          </w:p>
+        </w:tc>
+        <w:tc>
+          <w:tcPr>
+            <w:tcW w:type="dxa" w:w="5900"/>
           </w:tcPr>
           <w:p>
             <w:r>
@@ -1367,17 +1714,138 @@
       <w:tr>
         <w:tc>
           <w:tcPr>
-            <w:tcW w:type="dxa" w:w="4320"/>
+            <w:tcW w:type="dxa" w:w="2740"/>
           </w:tcPr>
           <w:p>
             <w:r>
-              <w:t>7</w:t>
+              <w:t>Nguyễn Thị Thu Hà</w:t>
+              <w:br/>
+              <w:t>(Vòng đời phiếu mượn, Lấy sách &amp; Lập lịch)</w:t>
             </w:r>
           </w:p>
         </w:tc>
         <w:tc>
           <w:tcPr>
-            <w:tcW w:type="dxa" w:w="4320"/>
+            <w:tcW w:type="dxa" w:w="5900"/>
+          </w:tcPr>
+          <w:p>
+            <w:r>
+              <w:t>Tinh chỉnh giao diện phiếu mượn; chuẩn bị demo giữa kỳ (v2).</w:t>
+            </w:r>
+          </w:p>
+        </w:tc>
+      </w:tr>
+    </w:tbl>
+    <w:p>
+      <w:pPr/>
+    </w:p>
+    <w:p>
+      <w:pPr>
+        <w:pStyle w:val="Heading2"/>
+      </w:pPr>
+      <w:r>
+        <w:rPr>
+          <w:color w:val="1F3A5F"/>
+        </w:rPr>
+        <w:t>3.7  Tuần 7 — Tái thiết kế</w:t>
+      </w:r>
+    </w:p>
+    <w:tbl>
+      <w:tblPr>
+        <w:tblStyle w:val="LightGrid-Accent1"/>
+        <w:tblW w:type="auto" w:w="0"/>
+        <w:tblLook w:firstColumn="1" w:firstRow="1" w:lastColumn="0" w:lastRow="0" w:noHBand="0" w:noVBand="1" w:val="04A0"/>
+      </w:tblPr>
+      <w:tblGrid>
+        <w:gridCol w:w="4320"/>
+        <w:gridCol w:w="4320"/>
+      </w:tblGrid>
+      <w:tr>
+        <w:tc>
+          <w:tcPr>
+            <w:tcW w:type="dxa" w:w="2740"/>
+          </w:tcPr>
+          <w:p>
+            <w:r>
+              <w:t>Thành viên</w:t>
+            </w:r>
+          </w:p>
+        </w:tc>
+        <w:tc>
+          <w:tcPr>
+            <w:tcW w:type="dxa" w:w="5900"/>
+          </w:tcPr>
+          <w:p>
+            <w:r>
+              <w:t>Công việc trong tuần</w:t>
+            </w:r>
+          </w:p>
+        </w:tc>
+      </w:tr>
+      <w:tr>
+        <w:tc>
+          <w:tcPr>
+            <w:tcW w:type="dxa" w:w="2740"/>
+          </w:tcPr>
+          <w:p>
+            <w:r>
+              <w:t>Phạm Minh Tuyên</w:t>
+              <w:br/>
+              <w:t>(Xác thực, Người dùng &amp; Phân quyền)</w:t>
+            </w:r>
+          </w:p>
+        </w:tc>
+        <w:tc>
+          <w:tcPr>
+            <w:tcW w:type="dxa" w:w="5900"/>
+          </w:tcPr>
+          <w:p>
+            <w:r>
+              <w:t>Bổ sung vai trò LIBRARIAN; thiết kế phương án tách quyền Admin/Thủ thư (bỏ role hierarchy).</w:t>
+            </w:r>
+          </w:p>
+        </w:tc>
+      </w:tr>
+      <w:tr>
+        <w:tc>
+          <w:tcPr>
+            <w:tcW w:type="dxa" w:w="2740"/>
+          </w:tcPr>
+          <w:p>
+            <w:r>
+              <w:t>Lê Hà Hải Vân</w:t>
+              <w:br/>
+              <w:t>(Danh mục &amp; Tìm kiếm sách)</w:t>
+            </w:r>
+          </w:p>
+        </w:tc>
+        <w:tc>
+          <w:tcPr>
+            <w:tcW w:type="dxa" w:w="5900"/>
+          </w:tcPr>
+          <w:p>
+            <w:r>
+              <w:t>Phối hợp đưa cơ chế ẩn/hiện vào tìm kiếm (lọc theo tập loại tài liệu được phép xem).</w:t>
+            </w:r>
+          </w:p>
+        </w:tc>
+      </w:tr>
+      <w:tr>
+        <w:tc>
+          <w:tcPr>
+            <w:tcW w:type="dxa" w:w="2740"/>
+          </w:tcPr>
+          <w:p>
+            <w:r>
+              <w:t>Bùi Thanh Thảo</w:t>
+              <w:br/>
+              <w:t>(Quy tắc mượn, Ẩn/hiện &amp; Giỏ sách)</w:t>
+            </w:r>
+          </w:p>
+        </w:tc>
+        <w:tc>
+          <w:tcPr>
+            <w:tcW w:type="dxa" w:w="5900"/>
           </w:tcPr>
           <w:p>
             <w:r>
@@ -1389,17 +1857,138 @@
       <w:tr>
         <w:tc>
           <w:tcPr>
-            <w:tcW w:type="dxa" w:w="4320"/>
+            <w:tcW w:type="dxa" w:w="2740"/>
           </w:tcPr>
           <w:p>
             <w:r>
-              <w:t>8</w:t>
+              <w:t>Nguyễn Thị Thu Hà</w:t>
+              <w:br/>
+              <w:t>(Vòng đời phiếu mượn, Lấy sách &amp; Lập lịch)</w:t>
             </w:r>
           </w:p>
         </w:tc>
         <w:tc>
           <w:tcPr>
-            <w:tcW w:type="dxa" w:w="4320"/>
+            <w:tcW w:type="dxa" w:w="5900"/>
+          </w:tcPr>
+          <w:p>
+            <w:r>
+              <w:t>Thiết kế lại trạng thái AWAITING_PICKUP/BORROWED/COMPLETED/CANCELLED + RESERVED; thêm pickup_code/pickup_deadline/picked_up_at; submitLoan sinh mã 6 ký tự + hạn 24h.</w:t>
+            </w:r>
+          </w:p>
+        </w:tc>
+      </w:tr>
+    </w:tbl>
+    <w:p>
+      <w:pPr/>
+    </w:p>
+    <w:p>
+      <w:pPr>
+        <w:pStyle w:val="Heading2"/>
+      </w:pPr>
+      <w:r>
+        <w:rPr>
+          <w:color w:val="1F3A5F"/>
+        </w:rPr>
+        <w:t>3.8  Tuần 8 — Tự phục vụ</w:t>
+      </w:r>
+    </w:p>
+    <w:tbl>
+      <w:tblPr>
+        <w:tblStyle w:val="LightGrid-Accent1"/>
+        <w:tblW w:type="auto" w:w="0"/>
+        <w:tblLook w:firstColumn="1" w:firstRow="1" w:lastColumn="0" w:lastRow="0" w:noHBand="0" w:noVBand="1" w:val="04A0"/>
+      </w:tblPr>
+      <w:tblGrid>
+        <w:gridCol w:w="4320"/>
+        <w:gridCol w:w="4320"/>
+      </w:tblGrid>
+      <w:tr>
+        <w:tc>
+          <w:tcPr>
+            <w:tcW w:type="dxa" w:w="2740"/>
+          </w:tcPr>
+          <w:p>
+            <w:r>
+              <w:t>Thành viên</w:t>
+            </w:r>
+          </w:p>
+        </w:tc>
+        <w:tc>
+          <w:tcPr>
+            <w:tcW w:type="dxa" w:w="5900"/>
+          </w:tcPr>
+          <w:p>
+            <w:r>
+              <w:t>Công việc trong tuần</w:t>
+            </w:r>
+          </w:p>
+        </w:tc>
+      </w:tr>
+      <w:tr>
+        <w:tc>
+          <w:tcPr>
+            <w:tcW w:type="dxa" w:w="2740"/>
+          </w:tcPr>
+          <w:p>
+            <w:r>
+              <w:t>Phạm Minh Tuyên</w:t>
+              <w:br/>
+              <w:t>(Xác thực, Người dùng &amp; Phân quyền)</w:t>
+            </w:r>
+          </w:p>
+        </w:tc>
+        <w:tc>
+          <w:tcPr>
+            <w:tcW w:type="dxa" w:w="5900"/>
+          </w:tcPr>
+          <w:p>
+            <w:r>
+              <w:t>Viết lại matcher SecurityConfig (/admin/**→ADMIN, /librarian/**→LIBRARIAN, /client/**→bạn đọc); sửa điều hướng sau đăng nhập.</w:t>
+            </w:r>
+          </w:p>
+        </w:tc>
+      </w:tr>
+      <w:tr>
+        <w:tc>
+          <w:tcPr>
+            <w:tcW w:type="dxa" w:w="2740"/>
+          </w:tcPr>
+          <w:p>
+            <w:r>
+              <w:t>Lê Hà Hải Vân</w:t>
+              <w:br/>
+              <w:t>(Danh mục &amp; Tìm kiếm sách)</w:t>
+            </w:r>
+          </w:p>
+        </w:tc>
+        <w:tc>
+          <w:tcPr>
+            <w:tcW w:type="dxa" w:w="5900"/>
+          </w:tcPr>
+          <w:p>
+            <w:r>
+              <w:t>Cập nhật home/book-detail chỉ hiển thị loại tài liệu được phép với vai trò; cờ 'đã ở trong giỏ'.</w:t>
+            </w:r>
+          </w:p>
+        </w:tc>
+      </w:tr>
+      <w:tr>
+        <w:tc>
+          <w:tcPr>
+            <w:tcW w:type="dxa" w:w="2740"/>
+          </w:tcPr>
+          <w:p>
+            <w:r>
+              <w:t>Bùi Thanh Thảo</w:t>
+              <w:br/>
+              <w:t>(Quy tắc mượn, Ẩn/hiện &amp; Giỏ sách)</w:t>
+            </w:r>
+          </w:p>
+        </w:tc>
+        <w:tc>
+          <w:tcPr>
+            <w:tcW w:type="dxa" w:w="5900"/>
           </w:tcPr>
           <w:p>
             <w:r>
@@ -1411,17 +2000,138 @@
       <w:tr>
         <w:tc>
           <w:tcPr>
-            <w:tcW w:type="dxa" w:w="4320"/>
+            <w:tcW w:type="dxa" w:w="2740"/>
           </w:tcPr>
           <w:p>
             <w:r>
-              <w:t>9</w:t>
+              <w:t>Nguyễn Thị Thu Hà</w:t>
+              <w:br/>
+              <w:t>(Vòng đời phiếu mượn, Lấy sách &amp; Lập lịch)</w:t>
             </w:r>
           </w:p>
         </w:tc>
         <w:tc>
           <w:tcPr>
-            <w:tcW w:type="dxa" w:w="4320"/>
+            <w:tcW w:type="dxa" w:w="5900"/>
+          </w:tcPr>
+          <w:p>
+            <w:r>
+              <w:t>confirmPickup (bạn đọc tự nhập mã → BORROWED), bỏ bước duyệt; PickupExpiryScheduler + @EnableScheduling (cancelExpiredPickups tự huỷ sau 24h).</w:t>
+            </w:r>
+          </w:p>
+        </w:tc>
+      </w:tr>
+    </w:tbl>
+    <w:p>
+      <w:pPr/>
+    </w:p>
+    <w:p>
+      <w:pPr>
+        <w:pStyle w:val="Heading2"/>
+      </w:pPr>
+      <w:r>
+        <w:rPr>
+          <w:color w:val="1F3A5F"/>
+        </w:rPr>
+        <w:t>3.9  Tuần 9 — Tách quyền</w:t>
+      </w:r>
+    </w:p>
+    <w:tbl>
+      <w:tblPr>
+        <w:tblStyle w:val="LightGrid-Accent1"/>
+        <w:tblW w:type="auto" w:w="0"/>
+        <w:tblLook w:firstColumn="1" w:firstRow="1" w:lastColumn="0" w:lastRow="0" w:noHBand="0" w:noVBand="1" w:val="04A0"/>
+      </w:tblPr>
+      <w:tblGrid>
+        <w:gridCol w:w="4320"/>
+        <w:gridCol w:w="4320"/>
+      </w:tblGrid>
+      <w:tr>
+        <w:tc>
+          <w:tcPr>
+            <w:tcW w:type="dxa" w:w="2740"/>
+          </w:tcPr>
+          <w:p>
+            <w:r>
+              <w:t>Thành viên</w:t>
+            </w:r>
+          </w:p>
+        </w:tc>
+        <w:tc>
+          <w:tcPr>
+            <w:tcW w:type="dxa" w:w="5900"/>
+          </w:tcPr>
+          <w:p>
+            <w:r>
+              <w:t>Công việc trong tuần</w:t>
+            </w:r>
+          </w:p>
+        </w:tc>
+      </w:tr>
+      <w:tr>
+        <w:tc>
+          <w:tcPr>
+            <w:tcW w:type="dxa" w:w="2740"/>
+          </w:tcPr>
+          <w:p>
+            <w:r>
+              <w:t>Phạm Minh Tuyên</w:t>
+              <w:br/>
+              <w:t>(Xác thực, Người dùng &amp; Phân quyền)</w:t>
+            </w:r>
+          </w:p>
+        </w:tc>
+        <w:tc>
+          <w:tcPr>
+            <w:tcW w:type="dxa" w:w="5900"/>
+          </w:tcPr>
+          <w:p>
+            <w:r>
+              <w:t>AdminController + UserService.create (tạo tài khoản, gán vai trò, POST /admin/users); enum Permission + RolePermission + PermissionService (has/grantedFor/updateGrantsForRole).</w:t>
+            </w:r>
+          </w:p>
+        </w:tc>
+      </w:tr>
+      <w:tr>
+        <w:tc>
+          <w:tcPr>
+            <w:tcW w:type="dxa" w:w="2740"/>
+          </w:tcPr>
+          <w:p>
+            <w:r>
+              <w:t>Lê Hà Hải Vân</w:t>
+              <w:br/>
+              <w:t>(Danh mục &amp; Tìm kiếm sách)</w:t>
+            </w:r>
+          </w:p>
+        </w:tc>
+        <w:tc>
+          <w:tcPr>
+            <w:tcW w:type="dxa" w:w="5900"/>
+          </w:tcPr>
+          <w:p>
+            <w:r>
+              <w:t>Chuyển quản lý sách &amp; tồn kho sang khu Thủ thư (route /librarian/books, navbar).</w:t>
+            </w:r>
+          </w:p>
+        </w:tc>
+      </w:tr>
+      <w:tr>
+        <w:tc>
+          <w:tcPr>
+            <w:tcW w:type="dxa" w:w="2740"/>
+          </w:tcPr>
+          <w:p>
+            <w:r>
+              <w:t>Bùi Thanh Thảo</w:t>
+              <w:br/>
+              <w:t>(Quy tắc mượn, Ẩn/hiện &amp; Giỏ sách)</w:t>
+            </w:r>
+          </w:p>
+        </w:tc>
+        <w:tc>
+          <w:tcPr>
+            <w:tcW w:type="dxa" w:w="5900"/>
           </w:tcPr>
           <w:p>
             <w:r>
@@ -1433,17 +2143,138 @@
       <w:tr>
         <w:tc>
           <w:tcPr>
-            <w:tcW w:type="dxa" w:w="4320"/>
+            <w:tcW w:type="dxa" w:w="2740"/>
           </w:tcPr>
           <w:p>
             <w:r>
-              <w:t>10</w:t>
+              <w:t>Nguyễn Thị Thu Hà</w:t>
+              <w:br/>
+              <w:t>(Vòng đời phiếu mượn, Lấy sách &amp; Lập lịch)</w:t>
             </w:r>
           </w:p>
         </w:tc>
         <w:tc>
           <w:tcPr>
-            <w:tcW w:type="dxa" w:w="4320"/>
+            <w:tcW w:type="dxa" w:w="5900"/>
+          </w:tcPr>
+          <w:p>
+            <w:r>
+              <w:t>cancelLoan/cancelByReader (huỷ kèm lý do, hoàn số lượng); cập nhật my-loans ('Đơn chờ lấy' + ô nhập mã) và loans.html (bỏ nút duyệt, chỉ chuẩn bị sách).</w:t>
+            </w:r>
+          </w:p>
+        </w:tc>
+      </w:tr>
+    </w:tbl>
+    <w:p>
+      <w:pPr/>
+    </w:p>
+    <w:p>
+      <w:pPr>
+        <w:pStyle w:val="Heading2"/>
+      </w:pPr>
+      <w:r>
+        <w:rPr>
+          <w:color w:val="1F3A5F"/>
+        </w:rPr>
+        <w:t>3.10  Tuần 10 — Cấu hình &amp; mở rộng</w:t>
+      </w:r>
+    </w:p>
+    <w:tbl>
+      <w:tblPr>
+        <w:tblStyle w:val="LightGrid-Accent1"/>
+        <w:tblW w:type="auto" w:w="0"/>
+        <w:tblLook w:firstColumn="1" w:firstRow="1" w:lastColumn="0" w:lastRow="0" w:noHBand="0" w:noVBand="1" w:val="04A0"/>
+      </w:tblPr>
+      <w:tblGrid>
+        <w:gridCol w:w="4320"/>
+        <w:gridCol w:w="4320"/>
+      </w:tblGrid>
+      <w:tr>
+        <w:tc>
+          <w:tcPr>
+            <w:tcW w:type="dxa" w:w="2740"/>
+          </w:tcPr>
+          <w:p>
+            <w:r>
+              <w:t>Thành viên</w:t>
+            </w:r>
+          </w:p>
+        </w:tc>
+        <w:tc>
+          <w:tcPr>
+            <w:tcW w:type="dxa" w:w="5900"/>
+          </w:tcPr>
+          <w:p>
+            <w:r>
+              <w:t>Công việc trong tuần</w:t>
+            </w:r>
+          </w:p>
+        </w:tc>
+      </w:tr>
+      <w:tr>
+        <w:tc>
+          <w:tcPr>
+            <w:tcW w:type="dxa" w:w="2740"/>
+          </w:tcPr>
+          <w:p>
+            <w:r>
+              <w:t>Phạm Minh Tuyên</w:t>
+              <w:br/>
+              <w:t>(Xác thực, Người dùng &amp; Phân quyền)</w:t>
+            </w:r>
+          </w:p>
+        </w:tc>
+        <w:tc>
+          <w:tcPr>
+            <w:tcW w:type="dxa" w:w="5900"/>
+          </w:tcPr>
+          <w:p>
+            <w:r>
+              <w:t>Trang ma trận phân quyền permissions.html (GET/POST /admin/permissions) bật/tắt quyền theo vai trò.</w:t>
+            </w:r>
+          </w:p>
+        </w:tc>
+      </w:tr>
+      <w:tr>
+        <w:tc>
+          <w:tcPr>
+            <w:tcW w:type="dxa" w:w="2740"/>
+          </w:tcPr>
+          <w:p>
+            <w:r>
+              <w:t>Lê Hà Hải Vân</w:t>
+              <w:br/>
+              <w:t>(Danh mục &amp; Tìm kiếm sách)</w:t>
+            </w:r>
+          </w:p>
+        </w:tc>
+        <w:tc>
+          <w:tcPr>
+            <w:tcW w:type="dxa" w:w="5900"/>
+          </w:tcPr>
+          <w:p>
+            <w:r>
+              <w:t>Phối hợp chặn thêm vào giỏ với loại đang bị ẩn/RESTRICTED; xử lý ảnh bìa/placeholder.</w:t>
+            </w:r>
+          </w:p>
+        </w:tc>
+      </w:tr>
+      <w:tr>
+        <w:tc>
+          <w:tcPr>
+            <w:tcW w:type="dxa" w:w="2740"/>
+          </w:tcPr>
+          <w:p>
+            <w:r>
+              <w:t>Bùi Thanh Thảo</w:t>
+              <w:br/>
+              <w:t>(Quy tắc mượn, Ẩn/hiện &amp; Giỏ sách)</w:t>
+            </w:r>
+          </w:p>
+        </w:tc>
+        <w:tc>
+          <w:tcPr>
+            <w:tcW w:type="dxa" w:w="5900"/>
           </w:tcPr>
           <w:p>
             <w:r>
@@ -1455,17 +2286,138 @@
       <w:tr>
         <w:tc>
           <w:tcPr>
-            <w:tcW w:type="dxa" w:w="4320"/>
+            <w:tcW w:type="dxa" w:w="2740"/>
           </w:tcPr>
           <w:p>
             <w:r>
-              <w:t>11</w:t>
+              <w:t>Nguyễn Thị Thu Hà</w:t>
+              <w:br/>
+              <w:t>(Vòng đời phiếu mượn, Lấy sách &amp; Lập lịch)</w:t>
             </w:r>
           </w:p>
         </w:tc>
         <w:tc>
           <w:tcPr>
-            <w:tcW w:type="dxa" w:w="4320"/>
+            <w:tcW w:type="dxa" w:w="5900"/>
+          </w:tcPr>
+          <w:p>
+            <w:r>
+              <w:t>NotificationService (notify/notifyRole) + Notification.java + notifications.html (chuông navbar); lendInHouse + inhouse.html (đọc tại chỗ) trong LibrarianController.</w:t>
+            </w:r>
+          </w:p>
+        </w:tc>
+      </w:tr>
+    </w:tbl>
+    <w:p>
+      <w:pPr/>
+    </w:p>
+    <w:p>
+      <w:pPr>
+        <w:pStyle w:val="Heading2"/>
+      </w:pPr>
+      <w:r>
+        <w:rPr>
+          <w:color w:val="1F3A5F"/>
+        </w:rPr>
+        <w:t>3.11  Tuần 11 — Sửa lỗi &amp; nâng cấp</w:t>
+      </w:r>
+    </w:p>
+    <w:tbl>
+      <w:tblPr>
+        <w:tblStyle w:val="LightGrid-Accent1"/>
+        <w:tblW w:type="auto" w:w="0"/>
+        <w:tblLook w:firstColumn="1" w:firstRow="1" w:lastColumn="0" w:lastRow="0" w:noHBand="0" w:noVBand="1" w:val="04A0"/>
+      </w:tblPr>
+      <w:tblGrid>
+        <w:gridCol w:w="4320"/>
+        <w:gridCol w:w="4320"/>
+      </w:tblGrid>
+      <w:tr>
+        <w:tc>
+          <w:tcPr>
+            <w:tcW w:type="dxa" w:w="2740"/>
+          </w:tcPr>
+          <w:p>
+            <w:r>
+              <w:t>Thành viên</w:t>
+            </w:r>
+          </w:p>
+        </w:tc>
+        <w:tc>
+          <w:tcPr>
+            <w:tcW w:type="dxa" w:w="5900"/>
+          </w:tcPr>
+          <w:p>
+            <w:r>
+              <w:t>Công việc trong tuần</w:t>
+            </w:r>
+          </w:p>
+        </w:tc>
+      </w:tr>
+      <w:tr>
+        <w:tc>
+          <w:tcPr>
+            <w:tcW w:type="dxa" w:w="2740"/>
+          </w:tcPr>
+          <w:p>
+            <w:r>
+              <w:t>Phạm Minh Tuyên</w:t>
+              <w:br/>
+              <w:t>(Xác thực, Người dùng &amp; Phân quyền)</w:t>
+            </w:r>
+          </w:p>
+        </w:tc>
+        <w:tc>
+          <w:tcPr>
+            <w:tcW w:type="dxa" w:w="5900"/>
+          </w:tcPr>
+          <w:p>
+            <w:r>
+              <w:t>AccountController + UserService.changePassword + change-password.html (tự đổi mật khẩu mọi vai trò); seed 82 tài khoản &amp; ma trận quyền mặc định trong data.sql.</w:t>
+            </w:r>
+          </w:p>
+        </w:tc>
+      </w:tr>
+      <w:tr>
+        <w:tc>
+          <w:tcPr>
+            <w:tcW w:type="dxa" w:w="2740"/>
+          </w:tcPr>
+          <w:p>
+            <w:r>
+              <w:t>Lê Hà Hải Vân</w:t>
+              <w:br/>
+              <w:t>(Danh mục &amp; Tìm kiếm sách)</w:t>
+            </w:r>
+          </w:p>
+        </w:tc>
+        <w:tc>
+          <w:tcPr>
+            <w:tcW w:type="dxa" w:w="5900"/>
+          </w:tcPr>
+          <w:p>
+            <w:r>
+              <w:t>Đồng bộ availableCopies khi mượn/trả/huỷ; rà soát hiển thị tồn kho.</w:t>
+            </w:r>
+          </w:p>
+        </w:tc>
+      </w:tr>
+      <w:tr>
+        <w:tc>
+          <w:tcPr>
+            <w:tcW w:type="dxa" w:w="2740"/>
+          </w:tcPr>
+          <w:p>
+            <w:r>
+              <w:t>Bùi Thanh Thảo</w:t>
+              <w:br/>
+              <w:t>(Quy tắc mượn, Ẩn/hiện &amp; Giỏ sách)</w:t>
+            </w:r>
+          </w:p>
+        </w:tc>
+        <w:tc>
+          <w:tcPr>
+            <w:tcW w:type="dxa" w:w="5900"/>
           </w:tcPr>
           <w:p>
             <w:r>
@@ -1477,27 +2429,31 @@
       <w:tr>
         <w:tc>
           <w:tcPr>
-            <w:tcW w:type="dxa" w:w="4320"/>
+            <w:tcW w:type="dxa" w:w="2740"/>
           </w:tcPr>
           <w:p>
             <w:r>
-              <w:t>12</w:t>
+              <w:t>Nguyễn Thị Thu Hà</w:t>
+              <w:br/>
+              <w:t>(Vòng đời phiếu mượn, Lấy sách &amp; Lập lịch)</w:t>
             </w:r>
           </w:p>
         </w:tc>
         <w:tc>
           <w:tcPr>
-            <w:tcW w:type="dxa" w:w="4320"/>
+            <w:tcW w:type="dxa" w:w="5900"/>
           </w:tcPr>
           <w:p>
             <w:r>
-              <w:t>Kiểm thử quota &amp; ẩn/hiện loại tài liệu; viết phần báo cáo tương ứng.</w:t>
+              <w:t>Sửa lỗi giữ chỗ trong submitLoan (kiểm tra tồn kho trước khi trừ); payFine + finePaid → refreshCompletion (COMPLETED); sendDueReminders.</w:t>
             </w:r>
           </w:p>
         </w:tc>
       </w:tr>
     </w:tbl>
-    <w:p/>
+    <w:p>
+      <w:pPr/>
+    </w:p>
     <w:p>
       <w:pPr>
         <w:pStyle w:val="Heading2"/>
@@ -1506,14 +2462,13 @@
         <w:rPr>
           <w:color w:val="1F3A5F"/>
         </w:rPr>
-        <w:t>3.3  Phạm Minh Tuyên — Xác thực, Người dùng &amp; Phân quyền</w:t>
+        <w:t>3.12  Tuần 12 — Rà soát &amp; bàn giao</w:t>
       </w:r>
     </w:p>
     <w:tbl>
       <w:tblPr>
         <w:tblStyle w:val="LightGrid-Accent1"/>
         <w:tblW w:type="auto" w:w="0"/>
-        <w:jc w:val="center"/>
         <w:tblLook w:firstColumn="1" w:firstRow="1" w:lastColumn="0" w:lastRow="0" w:noHBand="0" w:noVBand="1" w:val="04A0"/>
       </w:tblPr>
       <w:tblGrid>
@@ -1523,21 +2478,21 @@
       <w:tr>
         <w:tc>
           <w:tcPr>
-            <w:tcW w:type="dxa" w:w="4320"/>
+            <w:tcW w:type="dxa" w:w="2740"/>
           </w:tcPr>
           <w:p>
             <w:r>
-              <w:t>Tuần</w:t>
+              <w:t>Thành viên</w:t>
             </w:r>
           </w:p>
         </w:tc>
         <w:tc>
           <w:tcPr>
-            <w:tcW w:type="dxa" w:w="4320"/>
+            <w:tcW w:type="dxa" w:w="5900"/>
           </w:tcPr>
           <w:p>
             <w:r>
-              <w:t>Công việc chính</w:t>
+              <w:t>Công việc trong tuần</w:t>
             </w:r>
           </w:p>
         </w:tc>
@@ -1545,259 +2500,19 @@
       <w:tr>
         <w:tc>
           <w:tcPr>
-            <w:tcW w:type="dxa" w:w="4320"/>
+            <w:tcW w:type="dxa" w:w="2740"/>
           </w:tcPr>
           <w:p>
             <w:r>
-              <w:t>1</w:t>
+              <w:t>Phạm Minh Tuyên</w:t>
+              <w:br/>
+              <w:t>(Xác thực, Người dùng &amp; Phân quyền)</w:t>
             </w:r>
           </w:p>
         </w:tc>
         <w:tc>
           <w:tcPr>
-            <w:tcW w:type="dxa" w:w="4320"/>
-          </w:tcPr>
-          <w:p>
-            <w:r>
-              <w:t>Tham gia phân tích yêu cầu; thiết kế bảng users &amp; sơ đồ vai trò; chọn cơ chế bảo mật (form login + BCrypt).</w:t>
-            </w:r>
-          </w:p>
-        </w:tc>
-      </w:tr>
-      <w:tr>
-        <w:tc>
-          <w:tcPr>
-            <w:tcW w:type="dxa" w:w="4320"/>
-          </w:tcPr>
-          <w:p>
-            <w:r>
-              <w:t>2</w:t>
-            </w:r>
-          </w:p>
-        </w:tc>
-        <w:tc>
-          <w:tcPr>
-            <w:tcW w:type="dxa" w:w="4320"/>
-          </w:tcPr>
-          <w:p>
-            <w:r>
-              <w:t>Entity User, enum UserRole/CardStatus; UserRepository.findByStudentCode.</w:t>
-            </w:r>
-          </w:p>
-        </w:tc>
-      </w:tr>
-      <w:tr>
-        <w:tc>
-          <w:tcPr>
-            <w:tcW w:type="dxa" w:w="4320"/>
-          </w:tcPr>
-          <w:p>
-            <w:r>
-              <w:t>3</w:t>
-            </w:r>
-          </w:p>
-        </w:tc>
-        <w:tc>
-          <w:tcPr>
-            <w:tcW w:type="dxa" w:w="4320"/>
-          </w:tcPr>
-          <w:p>
-            <w:r>
-              <w:t>Cấu hình SecurityConfig + CustomUserDetailsService; trang login.html; AuthController điều hướng theo vai trò.</w:t>
-            </w:r>
-          </w:p>
-        </w:tc>
-      </w:tr>
-      <w:tr>
-        <w:tc>
-          <w:tcPr>
-            <w:tcW w:type="dxa" w:w="4320"/>
-          </w:tcPr>
-          <w:p>
-            <w:r>
-              <w:t>4</w:t>
-            </w:r>
-          </w:p>
-        </w:tc>
-        <w:tc>
-          <w:tcPr>
-            <w:tcW w:type="dxa" w:w="4320"/>
-          </w:tcPr>
-          <w:p>
-            <w:r>
-              <w:t>UserService.findAll/search/toggleCardStatus; trang quản lý người dùng users.html (khoá/mở thẻ); trang lỗi 403/404.</w:t>
-            </w:r>
-          </w:p>
-        </w:tc>
-      </w:tr>
-      <w:tr>
-        <w:tc>
-          <w:tcPr>
-            <w:tcW w:type="dxa" w:w="4320"/>
-          </w:tcPr>
-          <w:p>
-            <w:r>
-              <w:t>5</w:t>
-            </w:r>
-          </w:p>
-        </w:tc>
-        <w:tc>
-          <w:tcPr>
-            <w:tcW w:type="dxa" w:w="4320"/>
-          </w:tcPr>
-          <w:p>
-            <w:r>
-              <w:t>Gắn xác thực vào các luồng nghiệp vụ; resetPassword; kiểm thử đăng nhập theo vai trò.</w:t>
-            </w:r>
-          </w:p>
-        </w:tc>
-      </w:tr>
-      <w:tr>
-        <w:tc>
-          <w:tcPr>
-            <w:tcW w:type="dxa" w:w="4320"/>
-          </w:tcPr>
-          <w:p>
-            <w:r>
-              <w:t>6</w:t>
-            </w:r>
-          </w:p>
-        </w:tc>
-        <w:tc>
-          <w:tcPr>
-            <w:tcW w:type="dxa" w:w="4320"/>
-          </w:tcPr>
-          <w:p>
-            <w:r>
-              <w:t>Rà soát bảo mật cho bản demo v2; chuẩn bị dữ liệu tài khoản mẫu.</w:t>
-            </w:r>
-          </w:p>
-        </w:tc>
-      </w:tr>
-      <w:tr>
-        <w:tc>
-          <w:tcPr>
-            <w:tcW w:type="dxa" w:w="4320"/>
-          </w:tcPr>
-          <w:p>
-            <w:r>
-              <w:t>7</w:t>
-            </w:r>
-          </w:p>
-        </w:tc>
-        <w:tc>
-          <w:tcPr>
-            <w:tcW w:type="dxa" w:w="4320"/>
-          </w:tcPr>
-          <w:p>
-            <w:r>
-              <w:t>Bổ sung vai trò LIBRARIAN; thiết kế phương án tách quyền Admin/Thủ thư (bỏ role hierarchy).</w:t>
-            </w:r>
-          </w:p>
-        </w:tc>
-      </w:tr>
-      <w:tr>
-        <w:tc>
-          <w:tcPr>
-            <w:tcW w:type="dxa" w:w="4320"/>
-          </w:tcPr>
-          <w:p>
-            <w:r>
-              <w:t>8</w:t>
-            </w:r>
-          </w:p>
-        </w:tc>
-        <w:tc>
-          <w:tcPr>
-            <w:tcW w:type="dxa" w:w="4320"/>
-          </w:tcPr>
-          <w:p>
-            <w:r>
-              <w:t>Viết lại matcher SecurityConfig (/admin/**→ADMIN, /librarian/**→LIBRARIAN, /client/**→bạn đọc); sửa điều hướng sau đăng nhập.</w:t>
-            </w:r>
-          </w:p>
-        </w:tc>
-      </w:tr>
-      <w:tr>
-        <w:tc>
-          <w:tcPr>
-            <w:tcW w:type="dxa" w:w="4320"/>
-          </w:tcPr>
-          <w:p>
-            <w:r>
-              <w:t>9</w:t>
-            </w:r>
-          </w:p>
-        </w:tc>
-        <w:tc>
-          <w:tcPr>
-            <w:tcW w:type="dxa" w:w="4320"/>
-          </w:tcPr>
-          <w:p>
-            <w:r>
-              <w:t>AdminController + UserService.create (tạo tài khoản, gán vai trò, POST /admin/users); enum Permission + RolePermission + PermissionService (has/grantedFor/updateGrantsForRole).</w:t>
-            </w:r>
-          </w:p>
-        </w:tc>
-      </w:tr>
-      <w:tr>
-        <w:tc>
-          <w:tcPr>
-            <w:tcW w:type="dxa" w:w="4320"/>
-          </w:tcPr>
-          <w:p>
-            <w:r>
-              <w:t>10</w:t>
-            </w:r>
-          </w:p>
-        </w:tc>
-        <w:tc>
-          <w:tcPr>
-            <w:tcW w:type="dxa" w:w="4320"/>
-          </w:tcPr>
-          <w:p>
-            <w:r>
-              <w:t>Trang ma trận phân quyền permissions.html (GET/POST /admin/permissions) bật/tắt quyền theo vai trò.</w:t>
-            </w:r>
-          </w:p>
-        </w:tc>
-      </w:tr>
-      <w:tr>
-        <w:tc>
-          <w:tcPr>
-            <w:tcW w:type="dxa" w:w="4320"/>
-          </w:tcPr>
-          <w:p>
-            <w:r>
-              <w:t>11</w:t>
-            </w:r>
-          </w:p>
-        </w:tc>
-        <w:tc>
-          <w:tcPr>
-            <w:tcW w:type="dxa" w:w="4320"/>
-          </w:tcPr>
-          <w:p>
-            <w:r>
-              <w:t>AccountController + UserService.changePassword + change-password.html (tự đổi mật khẩu mọi vai trò); seed 82 tài khoản &amp; ma trận quyền mặc định trong data.sql.</w:t>
-            </w:r>
-          </w:p>
-        </w:tc>
-      </w:tr>
-      <w:tr>
-        <w:tc>
-          <w:tcPr>
-            <w:tcW w:type="dxa" w:w="4320"/>
-          </w:tcPr>
-          <w:p>
-            <w:r>
-              <w:t>12</w:t>
-            </w:r>
-          </w:p>
-        </w:tc>
-        <w:tc>
-          <w:tcPr>
-            <w:tcW w:type="dxa" w:w="4320"/>
+            <w:tcW w:type="dxa" w:w="5900"/>
           </w:tcPr>
           <w:p>
             <w:r>
@@ -1806,308 +2521,22 @@
           </w:p>
         </w:tc>
       </w:tr>
-    </w:tbl>
-    <w:p/>
-    <w:p>
-      <w:pPr>
-        <w:pStyle w:val="Heading2"/>
-      </w:pPr>
-      <w:r>
-        <w:rPr>
-          <w:color w:val="1F3A5F"/>
-        </w:rPr>
-        <w:t>3.4  Lê Hà Hải Vân — Danh mục &amp; Tìm kiếm sách</w:t>
-      </w:r>
-    </w:p>
-    <w:tbl>
-      <w:tblPr>
-        <w:tblStyle w:val="LightGrid-Accent1"/>
-        <w:tblW w:type="auto" w:w="0"/>
-        <w:jc w:val="center"/>
-        <w:tblLook w:firstColumn="1" w:firstRow="1" w:lastColumn="0" w:lastRow="0" w:noHBand="0" w:noVBand="1" w:val="04A0"/>
-      </w:tblPr>
-      <w:tblGrid>
-        <w:gridCol w:w="4320"/>
-        <w:gridCol w:w="4320"/>
-      </w:tblGrid>
       <w:tr>
         <w:tc>
           <w:tcPr>
-            <w:tcW w:type="dxa" w:w="4320"/>
+            <w:tcW w:type="dxa" w:w="2740"/>
           </w:tcPr>
           <w:p>
             <w:r>
-              <w:t>Tuần</w:t>
+              <w:t>Lê Hà Hải Vân</w:t>
+              <w:br/>
+              <w:t>(Danh mục &amp; Tìm kiếm sách)</w:t>
             </w:r>
           </w:p>
         </w:tc>
         <w:tc>
           <w:tcPr>
-            <w:tcW w:type="dxa" w:w="4320"/>
-          </w:tcPr>
-          <w:p>
-            <w:r>
-              <w:t>Công việc chính</w:t>
-            </w:r>
-          </w:p>
-        </w:tc>
-      </w:tr>
-      <w:tr>
-        <w:tc>
-          <w:tcPr>
-            <w:tcW w:type="dxa" w:w="4320"/>
-          </w:tcPr>
-          <w:p>
-            <w:r>
-              <w:t>1</w:t>
-            </w:r>
-          </w:p>
-        </w:tc>
-        <w:tc>
-          <w:tcPr>
-            <w:tcW w:type="dxa" w:w="4320"/>
-          </w:tcPr>
-          <w:p>
-            <w:r>
-              <w:t>Phân tích yêu cầu tra cứu; thiết kế bảng books và 4 loại tài liệu (DocType).</w:t>
-            </w:r>
-          </w:p>
-        </w:tc>
-      </w:tr>
-      <w:tr>
-        <w:tc>
-          <w:tcPr>
-            <w:tcW w:type="dxa" w:w="4320"/>
-          </w:tcPr>
-          <w:p>
-            <w:r>
-              <w:t>2</w:t>
-            </w:r>
-          </w:p>
-        </w:tc>
-        <w:tc>
-          <w:tcPr>
-            <w:tcW w:type="dxa" w:w="4320"/>
-          </w:tcPr>
-          <w:p>
-            <w:r>
-              <w:t>Entity Book + enum DocType/BookCondition; BookRepository.searchBooks (LIKE theo nhan đề/tác giả/ISBN/mã phân loại).</w:t>
-            </w:r>
-          </w:p>
-        </w:tc>
-      </w:tr>
-      <w:tr>
-        <w:tc>
-          <w:tcPr>
-            <w:tcW w:type="dxa" w:w="4320"/>
-          </w:tcPr>
-          <w:p>
-            <w:r>
-              <w:t>3</w:t>
-            </w:r>
-          </w:p>
-        </w:tc>
-        <w:tc>
-          <w:tcPr>
-            <w:tcW w:type="dxa" w:w="4320"/>
-          </w:tcPr>
-          <w:p>
-            <w:r>
-              <w:t>BookService (search, CRUD, toForm); khởi tạo trang chủ home.html.</w:t>
-            </w:r>
-          </w:p>
-        </w:tc>
-      </w:tr>
-      <w:tr>
-        <w:tc>
-          <w:tcPr>
-            <w:tcW w:type="dxa" w:w="4320"/>
-          </w:tcPr>
-          <w:p>
-            <w:r>
-              <w:t>4</w:t>
-            </w:r>
-          </w:p>
-        </w:tc>
-        <w:tc>
-          <w:tcPr>
-            <w:tcW w:type="dxa" w:w="4320"/>
-          </w:tcPr>
-          <w:p>
-            <w:r>
-              <w:t>Hoàn thiện home.html (từ khoá, lọc loại, lọc còn sẵn); trang chi tiết book-detail.html.</w:t>
-            </w:r>
-          </w:p>
-        </w:tc>
-      </w:tr>
-      <w:tr>
-        <w:tc>
-          <w:tcPr>
-            <w:tcW w:type="dxa" w:w="4320"/>
-          </w:tcPr>
-          <w:p>
-            <w:r>
-              <w:t>5</w:t>
-            </w:r>
-          </w:p>
-        </w:tc>
-        <w:tc>
-          <w:tcPr>
-            <w:tcW w:type="dxa" w:w="4320"/>
-          </w:tcPr>
-          <w:p>
-            <w:r>
-              <w:t>Trang quản lý books.html và form book-form.html (thêm/sửa/xoá, chọn DocType, số lượng bản).</w:t>
-            </w:r>
-          </w:p>
-        </w:tc>
-      </w:tr>
-      <w:tr>
-        <w:tc>
-          <w:tcPr>
-            <w:tcW w:type="dxa" w:w="4320"/>
-          </w:tcPr>
-          <w:p>
-            <w:r>
-              <w:t>6</w:t>
-            </w:r>
-          </w:p>
-        </w:tc>
-        <w:tc>
-          <w:tcPr>
-            <w:tcW w:type="dxa" w:w="4320"/>
-          </w:tcPr>
-          <w:p>
-            <w:r>
-              <w:t>Tinh chỉnh giao diện Bootstrap danh mục; chuẩn bị 24 sách mẫu; demo giữa kỳ (v2).</w:t>
-            </w:r>
-          </w:p>
-        </w:tc>
-      </w:tr>
-      <w:tr>
-        <w:tc>
-          <w:tcPr>
-            <w:tcW w:type="dxa" w:w="4320"/>
-          </w:tcPr>
-          <w:p>
-            <w:r>
-              <w:t>7</w:t>
-            </w:r>
-          </w:p>
-        </w:tc>
-        <w:tc>
-          <w:tcPr>
-            <w:tcW w:type="dxa" w:w="4320"/>
-          </w:tcPr>
-          <w:p>
-            <w:r>
-              <w:t>Phối hợp đưa cơ chế ẩn/hiện vào tìm kiếm (lọc theo tập loại tài liệu được phép xem).</w:t>
-            </w:r>
-          </w:p>
-        </w:tc>
-      </w:tr>
-      <w:tr>
-        <w:tc>
-          <w:tcPr>
-            <w:tcW w:type="dxa" w:w="4320"/>
-          </w:tcPr>
-          <w:p>
-            <w:r>
-              <w:t>8</w:t>
-            </w:r>
-          </w:p>
-        </w:tc>
-        <w:tc>
-          <w:tcPr>
-            <w:tcW w:type="dxa" w:w="4320"/>
-          </w:tcPr>
-          <w:p>
-            <w:r>
-              <w:t>Cập nhật home/book-detail chỉ hiển thị loại tài liệu được phép với vai trò; cờ 'đã ở trong giỏ'.</w:t>
-            </w:r>
-          </w:p>
-        </w:tc>
-      </w:tr>
-      <w:tr>
-        <w:tc>
-          <w:tcPr>
-            <w:tcW w:type="dxa" w:w="4320"/>
-          </w:tcPr>
-          <w:p>
-            <w:r>
-              <w:t>9</w:t>
-            </w:r>
-          </w:p>
-        </w:tc>
-        <w:tc>
-          <w:tcPr>
-            <w:tcW w:type="dxa" w:w="4320"/>
-          </w:tcPr>
-          <w:p>
-            <w:r>
-              <w:t>Chuyển quản lý sách &amp; tồn kho sang khu Thủ thư (route /librarian/books, navbar).</w:t>
-            </w:r>
-          </w:p>
-        </w:tc>
-      </w:tr>
-      <w:tr>
-        <w:tc>
-          <w:tcPr>
-            <w:tcW w:type="dxa" w:w="4320"/>
-          </w:tcPr>
-          <w:p>
-            <w:r>
-              <w:t>10</w:t>
-            </w:r>
-          </w:p>
-        </w:tc>
-        <w:tc>
-          <w:tcPr>
-            <w:tcW w:type="dxa" w:w="4320"/>
-          </w:tcPr>
-          <w:p>
-            <w:r>
-              <w:t>Phối hợp chặn thêm vào giỏ với loại đang bị ẩn/RESTRICTED; xử lý ảnh bìa/placeholder.</w:t>
-            </w:r>
-          </w:p>
-        </w:tc>
-      </w:tr>
-      <w:tr>
-        <w:tc>
-          <w:tcPr>
-            <w:tcW w:type="dxa" w:w="4320"/>
-          </w:tcPr>
-          <w:p>
-            <w:r>
-              <w:t>11</w:t>
-            </w:r>
-          </w:p>
-        </w:tc>
-        <w:tc>
-          <w:tcPr>
-            <w:tcW w:type="dxa" w:w="4320"/>
-          </w:tcPr>
-          <w:p>
-            <w:r>
-              <w:t>Đồng bộ availableCopies khi mượn/trả/huỷ; rà soát hiển thị tồn kho.</w:t>
-            </w:r>
-          </w:p>
-        </w:tc>
-      </w:tr>
-      <w:tr>
-        <w:tc>
-          <w:tcPr>
-            <w:tcW w:type="dxa" w:w="4320"/>
-          </w:tcPr>
-          <w:p>
-            <w:r>
-              <w:t>12</w:t>
-            </w:r>
-          </w:p>
-        </w:tc>
-        <w:tc>
-          <w:tcPr>
-            <w:tcW w:type="dxa" w:w="4320"/>
+            <w:tcW w:type="dxa" w:w="5900"/>
           </w:tcPr>
           <w:p>
             <w:r>
@@ -2116,8 +2545,55 @@
           </w:p>
         </w:tc>
       </w:tr>
+      <w:tr>
+        <w:tc>
+          <w:tcPr>
+            <w:tcW w:type="dxa" w:w="2740"/>
+          </w:tcPr>
+          <w:p>
+            <w:r>
+              <w:t>Bùi Thanh Thảo</w:t>
+              <w:br/>
+              <w:t>(Quy tắc mượn, Ẩn/hiện &amp; Giỏ sách)</w:t>
+            </w:r>
+          </w:p>
+        </w:tc>
+        <w:tc>
+          <w:tcPr>
+            <w:tcW w:type="dxa" w:w="5900"/>
+          </w:tcPr>
+          <w:p>
+            <w:r>
+              <w:t>Kiểm thử quota &amp; ẩn/hiện loại tài liệu; viết phần báo cáo tương ứng.</w:t>
+            </w:r>
+          </w:p>
+        </w:tc>
+      </w:tr>
+      <w:tr>
+        <w:tc>
+          <w:tcPr>
+            <w:tcW w:type="dxa" w:w="2740"/>
+          </w:tcPr>
+          <w:p>
+            <w:r>
+              <w:t>Nguyễn Thị Thu Hà</w:t>
+              <w:br/>
+              <w:t>(Vòng đời phiếu mượn, Lấy sách &amp; Lập lịch)</w:t>
+            </w:r>
+          </w:p>
+        </w:tc>
+        <w:tc>
+          <w:tcPr>
+            <w:tcW w:type="dxa" w:w="5900"/>
+          </w:tcPr>
+          <w:p>
+            <w:r>
+              <w:t>Kiểm thử end-to-end (mượn→nhập mã→đang mượn, sai mã, tự huỷ, thu phí, đọc tại chỗ); viết phần báo cáo tương ứng.</w:t>
+            </w:r>
+          </w:p>
+        </w:tc>
+      </w:tr>
     </w:tbl>
-    <w:p/>
     <w:p>
       <w:pPr>
         <w:pStyle w:val="Heading1"/>

</xml_diff>